<commit_message>
GCC Compiler, GNU Debugger and Data Types
</commit_message>
<xml_diff>
--- a/LAB01/Lab1_Muhammad_Hammad.docx
+++ b/LAB01/Lab1_Muhammad_Hammad.docx
@@ -4,654 +4,12 @@
   <w:body>
     <w:p>
       <w:pPr>
-        <w:spacing w:after="0" w:line="259" w:lineRule="auto"/>
-        <w:ind w:left="24" w:firstLine="0"/>
-        <w:jc w:val="left"/>
-      </w:pPr>
-      <w:r>
-        <w:rPr>
-          <w:rFonts w:ascii="Calibri" w:eastAsia="Calibri" w:hAnsi="Calibri" w:cs="Calibri"/>
-          <w:noProof/>
-        </w:rPr>
-        <mc:AlternateContent>
-          <mc:Choice Requires="wpg">
-            <w:drawing>
-              <wp:anchor distT="0" distB="0" distL="114300" distR="114300" simplePos="0" relativeHeight="251675648" behindDoc="0" locked="0" layoutInCell="1" allowOverlap="1" wp14:anchorId="3866C8A8" wp14:editId="5A2C9ACA">
-                <wp:simplePos x="0" y="0"/>
-                <wp:positionH relativeFrom="margin">
-                  <wp:align>center</wp:align>
-                </wp:positionH>
-                <wp:positionV relativeFrom="paragraph">
-                  <wp:posOffset>771458</wp:posOffset>
-                </wp:positionV>
-                <wp:extent cx="5010785" cy="1743075"/>
-                <wp:effectExtent l="0" t="0" r="0" b="9525"/>
-                <wp:wrapThrough wrapText="bothSides">
-                  <wp:wrapPolygon edited="0">
-                    <wp:start x="3613" y="0"/>
-                    <wp:lineTo x="1068" y="3069"/>
-                    <wp:lineTo x="739" y="7554"/>
-                    <wp:lineTo x="328" y="9207"/>
-                    <wp:lineTo x="411" y="10859"/>
-                    <wp:lineTo x="0" y="11803"/>
-                    <wp:lineTo x="0" y="21246"/>
-                    <wp:lineTo x="903" y="21482"/>
-                    <wp:lineTo x="4517" y="21482"/>
-                    <wp:lineTo x="21515" y="20302"/>
-                    <wp:lineTo x="21515" y="13928"/>
-                    <wp:lineTo x="20530" y="11331"/>
-                    <wp:lineTo x="21515" y="10151"/>
-                    <wp:lineTo x="21515" y="8262"/>
-                    <wp:lineTo x="6980" y="7082"/>
-                    <wp:lineTo x="6652" y="4721"/>
-                    <wp:lineTo x="6570" y="3069"/>
-                    <wp:lineTo x="6241" y="2597"/>
-                    <wp:lineTo x="3942" y="0"/>
-                    <wp:lineTo x="3613" y="0"/>
-                  </wp:wrapPolygon>
-                </wp:wrapThrough>
-                <wp:docPr id="34113" name="Group 34113"/>
-                <wp:cNvGraphicFramePr/>
-                <a:graphic xmlns:a="http://schemas.openxmlformats.org/drawingml/2006/main">
-                  <a:graphicData uri="http://schemas.microsoft.com/office/word/2010/wordprocessingGroup">
-                    <wpg:wgp>
-                      <wpg:cNvGrpSpPr/>
-                      <wpg:grpSpPr>
-                        <a:xfrm>
-                          <a:off x="0" y="0"/>
-                          <a:ext cx="5010785" cy="1743075"/>
-                          <a:chOff x="0" y="0"/>
-                          <a:chExt cx="5010912" cy="1743075"/>
-                        </a:xfrm>
-                      </wpg:grpSpPr>
-                      <pic:pic xmlns:pic="http://schemas.openxmlformats.org/drawingml/2006/picture">
-                        <pic:nvPicPr>
-                          <pic:cNvPr id="10" name="Picture 10"/>
-                          <pic:cNvPicPr/>
-                        </pic:nvPicPr>
-                        <pic:blipFill>
-                          <a:blip r:embed="rId8"/>
-                          <a:stretch>
-                            <a:fillRect/>
-                          </a:stretch>
-                        </pic:blipFill>
-                        <pic:spPr>
-                          <a:xfrm>
-                            <a:off x="0" y="0"/>
-                            <a:ext cx="1778508" cy="1743075"/>
-                          </a:xfrm>
-                          <a:prstGeom prst="rect">
-                            <a:avLst/>
-                          </a:prstGeom>
-                        </pic:spPr>
-                      </pic:pic>
-                      <pic:pic xmlns:pic="http://schemas.openxmlformats.org/drawingml/2006/picture">
-                        <pic:nvPicPr>
-                          <pic:cNvPr id="12" name="Picture 12"/>
-                          <pic:cNvPicPr/>
-                        </pic:nvPicPr>
-                        <pic:blipFill>
-                          <a:blip r:embed="rId9"/>
-                          <a:stretch>
-                            <a:fillRect/>
-                          </a:stretch>
-                        </pic:blipFill>
-                        <pic:spPr>
-                          <a:xfrm>
-                            <a:off x="2286635" y="672466"/>
-                            <a:ext cx="2724277" cy="963295"/>
-                          </a:xfrm>
-                          <a:prstGeom prst="rect">
-                            <a:avLst/>
-                          </a:prstGeom>
-                        </pic:spPr>
-                      </pic:pic>
-                    </wpg:wgp>
-                  </a:graphicData>
-                </a:graphic>
-              </wp:anchor>
-            </w:drawing>
-          </mc:Choice>
-          <mc:Fallback>
-            <w:pict>
-              <v:group w14:anchorId="4894C91D" id="Group 34113" o:spid="_x0000_s1026" style="position:absolute;margin-left:0;margin-top:60.75pt;width:394.55pt;height:137.25pt;z-index:251675648;mso-position-horizontal:center;mso-position-horizontal-relative:margin" coordsize="50109,17430" o:gfxdata="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">
-                <v:shapetype id="_x0000_t75" coordsize="21600,21600" o:spt="75" o:preferrelative="t" path="m@4@5l@4@11@9@11@9@5xe" filled="f" stroked="f">
-                  <v:stroke joinstyle="miter"/>
-                  <v:formulas>
-                    <v:f eqn="if lineDrawn pixelLineWidth 0"/>
-                    <v:f eqn="sum @0 1 0"/>
-                    <v:f eqn="sum 0 0 @1"/>
-                    <v:f eqn="prod @2 1 2"/>
-                    <v:f eqn="prod @3 21600 pixelWidth"/>
-                    <v:f eqn="prod @3 21600 pixelHeight"/>
-                    <v:f eqn="sum @0 0 1"/>
-                    <v:f eqn="prod @6 1 2"/>
-                    <v:f eqn="prod @7 21600 pixelWidth"/>
-                    <v:f eqn="sum @8 21600 0"/>
-                    <v:f eqn="prod @7 21600 pixelHeight"/>
-                    <v:f eqn="sum @10 21600 0"/>
-                  </v:formulas>
-                  <v:path o:extrusionok="f" gradientshapeok="t" o:connecttype="rect"/>
-                  <o:lock v:ext="edit" aspectratio="t"/>
-                </v:shapetype>
-                <v:shape id="Picture 10" o:spid="_x0000_s1027" type="#_x0000_t75" style="position:absolute;width:17785;height:17430;visibility:visible;mso-wrap-style:square" o:gfxdata="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">
-                  <v:imagedata r:id="rId10" o:title=""/>
-                </v:shape>
-                <v:shape id="Picture 12" o:spid="_x0000_s1028" type="#_x0000_t75" style="position:absolute;left:22866;top:6724;width:27243;height:9633;visibility:visible;mso-wrap-style:square" o:gfxdata="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">
-                  <v:imagedata r:id="rId11" o:title=""/>
-                </v:shape>
-                <w10:wrap type="through" anchorx="margin"/>
-              </v:group>
-            </w:pict>
-          </mc:Fallback>
-        </mc:AlternateContent>
-      </w:r>
-      <w:r>
-        <w:rPr>
-          <w:noProof/>
-        </w:rPr>
-        <w:drawing>
-          <wp:inline distT="0" distB="0" distL="0" distR="0" wp14:anchorId="0B0F7F6E" wp14:editId="6C9849D1">
-            <wp:extent cx="1472057" cy="1019175"/>
-            <wp:effectExtent l="0" t="0" r="0" b="0"/>
-            <wp:docPr id="77" name="Picture 77"/>
-            <wp:cNvGraphicFramePr/>
-            <a:graphic xmlns:a="http://schemas.openxmlformats.org/drawingml/2006/main">
-              <a:graphicData uri="http://schemas.openxmlformats.org/drawingml/2006/picture">
-                <pic:pic xmlns:pic="http://schemas.openxmlformats.org/drawingml/2006/picture">
-                  <pic:nvPicPr>
-                    <pic:cNvPr id="77" name="Picture 77"/>
-                    <pic:cNvPicPr/>
-                  </pic:nvPicPr>
-                  <pic:blipFill>
-                    <a:blip r:embed="rId12"/>
-                    <a:stretch>
-                      <a:fillRect/>
-                    </a:stretch>
-                  </pic:blipFill>
-                  <pic:spPr>
-                    <a:xfrm>
-                      <a:off x="0" y="0"/>
-                      <a:ext cx="1472057" cy="1019175"/>
-                    </a:xfrm>
-                    <a:prstGeom prst="rect">
-                      <a:avLst/>
-                    </a:prstGeom>
-                  </pic:spPr>
-                </pic:pic>
-              </a:graphicData>
-            </a:graphic>
-          </wp:inline>
-        </w:drawing>
-      </w:r>
-      <w:r>
-        <w:rPr>
-          <w:sz w:val="20"/>
-        </w:rPr>
-        <w:t xml:space="preserve"> </w:t>
-      </w:r>
-    </w:p>
-    <w:p>
-      <w:pPr>
-        <w:spacing w:after="0" w:line="259" w:lineRule="auto"/>
-        <w:ind w:left="0" w:firstLine="0"/>
-        <w:jc w:val="left"/>
-      </w:pPr>
-      <w:r>
-        <w:rPr>
-          <w:sz w:val="20"/>
-        </w:rPr>
-        <w:t xml:space="preserve"> </w:t>
-      </w:r>
-    </w:p>
-    <w:p>
-      <w:pPr>
-        <w:spacing w:after="0" w:line="259" w:lineRule="auto"/>
-        <w:ind w:left="0" w:firstLine="0"/>
-        <w:jc w:val="left"/>
-      </w:pPr>
-      <w:r>
-        <w:rPr>
-          <w:sz w:val="20"/>
-        </w:rPr>
-        <w:t xml:space="preserve"> </w:t>
-      </w:r>
-    </w:p>
-    <w:p>
-      <w:pPr>
-        <w:spacing w:after="0" w:line="259" w:lineRule="auto"/>
-        <w:ind w:left="0" w:firstLine="0"/>
-        <w:jc w:val="left"/>
-      </w:pPr>
-      <w:r>
-        <w:rPr>
-          <w:sz w:val="20"/>
-        </w:rPr>
-        <w:t xml:space="preserve"> </w:t>
-      </w:r>
-    </w:p>
-    <w:p>
-      <w:pPr>
-        <w:spacing w:after="0" w:line="259" w:lineRule="auto"/>
-        <w:ind w:left="0" w:firstLine="0"/>
-        <w:jc w:val="left"/>
-      </w:pPr>
-      <w:r>
-        <w:rPr>
-          <w:sz w:val="20"/>
-        </w:rPr>
-        <w:t xml:space="preserve"> </w:t>
-      </w:r>
-    </w:p>
-    <w:p>
-      <w:pPr>
-        <w:spacing w:after="0" w:line="259" w:lineRule="auto"/>
-        <w:ind w:left="0" w:firstLine="0"/>
-        <w:jc w:val="left"/>
-      </w:pPr>
-      <w:r>
-        <w:rPr>
-          <w:sz w:val="20"/>
-        </w:rPr>
-        <w:t xml:space="preserve"> </w:t>
-      </w:r>
-    </w:p>
-    <w:p>
-      <w:pPr>
-        <w:spacing w:after="17" w:line="259" w:lineRule="auto"/>
-        <w:ind w:left="0" w:firstLine="0"/>
-        <w:jc w:val="left"/>
-      </w:pPr>
-      <w:r>
-        <w:rPr>
-          <w:sz w:val="20"/>
-        </w:rPr>
-        <w:t xml:space="preserve"> </w:t>
-      </w:r>
-    </w:p>
-    <w:p>
-      <w:pPr>
-        <w:spacing w:after="0" w:line="259" w:lineRule="auto"/>
-        <w:ind w:left="0" w:firstLine="0"/>
-        <w:jc w:val="left"/>
-      </w:pPr>
-      <w:r>
-        <w:rPr>
-          <w:sz w:val="20"/>
-        </w:rPr>
-        <w:t xml:space="preserve"> </w:t>
-      </w:r>
-    </w:p>
-    <w:p>
-      <w:pPr>
-        <w:spacing w:after="15" w:line="259" w:lineRule="auto"/>
-        <w:ind w:left="723" w:firstLine="0"/>
-        <w:jc w:val="left"/>
-      </w:pPr>
-    </w:p>
-    <w:p>
-      <w:pPr>
-        <w:spacing w:after="0" w:line="259" w:lineRule="auto"/>
-        <w:ind w:left="0" w:firstLine="0"/>
-        <w:jc w:val="left"/>
-      </w:pPr>
-      <w:r>
-        <w:rPr>
-          <w:sz w:val="40"/>
-        </w:rPr>
-        <w:t xml:space="preserve"> </w:t>
-      </w:r>
-    </w:p>
-    <w:p>
-      <w:pPr>
-        <w:spacing w:after="0" w:line="259" w:lineRule="auto"/>
-        <w:ind w:left="0" w:firstLine="0"/>
-        <w:jc w:val="left"/>
-      </w:pPr>
-      <w:r>
-        <w:rPr>
-          <w:sz w:val="40"/>
-        </w:rPr>
-        <w:t xml:space="preserve"> </w:t>
-      </w:r>
-    </w:p>
-    <w:p>
-      <w:pPr>
-        <w:spacing w:after="0" w:line="259" w:lineRule="auto"/>
-        <w:ind w:left="0" w:firstLine="0"/>
-        <w:jc w:val="left"/>
-      </w:pPr>
-      <w:r>
-        <w:rPr>
-          <w:sz w:val="40"/>
-        </w:rPr>
-        <w:t xml:space="preserve"> </w:t>
-      </w:r>
-    </w:p>
-    <w:p>
-      <w:pPr>
-        <w:spacing w:after="311" w:line="259" w:lineRule="auto"/>
-        <w:ind w:left="0" w:firstLine="0"/>
-        <w:jc w:val="left"/>
-      </w:pPr>
-      <w:r>
-        <w:rPr>
-          <w:sz w:val="40"/>
-        </w:rPr>
-        <w:t xml:space="preserve"> </w:t>
-      </w:r>
-    </w:p>
-    <w:p>
-      <w:pPr>
-        <w:spacing w:after="0" w:line="259" w:lineRule="auto"/>
-        <w:ind w:left="0" w:firstLine="0"/>
-        <w:jc w:val="left"/>
-      </w:pPr>
-      <w:r>
-        <w:rPr>
-          <w:sz w:val="40"/>
-        </w:rPr>
-        <w:t xml:space="preserve"> </w:t>
-      </w:r>
-    </w:p>
-    <w:p>
-      <w:pPr>
-        <w:spacing w:after="0" w:line="259" w:lineRule="auto"/>
-        <w:ind w:left="0" w:right="400" w:firstLine="0"/>
-        <w:jc w:val="center"/>
-      </w:pPr>
-      <w:r>
-        <w:rPr>
-          <w:b/>
-          <w:sz w:val="40"/>
-        </w:rPr>
-        <w:t xml:space="preserve">Digital Design and Verification </w:t>
-      </w:r>
-    </w:p>
-    <w:p>
-      <w:pPr>
-        <w:spacing w:after="115" w:line="259" w:lineRule="auto"/>
-        <w:ind w:left="0" w:right="290" w:firstLine="0"/>
-        <w:jc w:val="center"/>
-      </w:pPr>
-      <w:r>
-        <w:rPr>
-          <w:b/>
-          <w:sz w:val="40"/>
-        </w:rPr>
-        <w:t xml:space="preserve"> </w:t>
-      </w:r>
-    </w:p>
-    <w:p>
-      <w:pPr>
-        <w:spacing w:after="187" w:line="259" w:lineRule="auto"/>
-        <w:ind w:left="10" w:right="411"/>
-        <w:jc w:val="center"/>
-      </w:pPr>
-      <w:r>
-        <w:rPr>
-          <w:b/>
-          <w:sz w:val="32"/>
-        </w:rPr>
-        <w:t xml:space="preserve">LAB # 01 </w:t>
-      </w:r>
-    </w:p>
-    <w:p>
-      <w:pPr>
-        <w:spacing w:after="0" w:line="259" w:lineRule="auto"/>
-        <w:ind w:left="10" w:right="414"/>
-        <w:jc w:val="center"/>
-      </w:pPr>
-      <w:r>
-        <w:rPr>
-          <w:b/>
-          <w:sz w:val="32"/>
-        </w:rPr>
-        <w:t>GCC Compil</w:t>
-      </w:r>
-      <w:r>
-        <w:rPr>
-          <w:b/>
-          <w:sz w:val="32"/>
-        </w:rPr>
-        <w:t>er, GNU Debugger and Data Types</w:t>
-      </w:r>
-      <w:r>
-        <w:rPr>
-          <w:b/>
-          <w:sz w:val="32"/>
-        </w:rPr>
-        <w:t xml:space="preserve"> </w:t>
-      </w:r>
-    </w:p>
-    <w:p>
-      <w:pPr>
-        <w:spacing w:after="0" w:line="259" w:lineRule="auto"/>
-        <w:ind w:left="0" w:firstLine="0"/>
-        <w:jc w:val="left"/>
-      </w:pPr>
-      <w:r>
-        <w:rPr>
-          <w:b/>
-          <w:sz w:val="32"/>
-        </w:rPr>
-        <w:t xml:space="preserve"> </w:t>
-      </w:r>
-    </w:p>
-    <w:p>
-      <w:pPr>
-        <w:spacing w:after="0" w:line="259" w:lineRule="auto"/>
-        <w:ind w:left="0" w:firstLine="0"/>
-        <w:jc w:val="left"/>
-      </w:pPr>
-      <w:r>
-        <w:rPr>
-          <w:b/>
-          <w:sz w:val="32"/>
-        </w:rPr>
-        <w:t xml:space="preserve"> </w:t>
-      </w:r>
-    </w:p>
-    <w:p>
-      <w:pPr>
-        <w:spacing w:after="0" w:line="259" w:lineRule="auto"/>
-        <w:ind w:left="0" w:firstLine="0"/>
-        <w:jc w:val="left"/>
-        <w:rPr>
-          <w:b/>
-          <w:sz w:val="32"/>
-        </w:rPr>
-      </w:pPr>
-    </w:p>
-    <w:p>
-      <w:pPr>
-        <w:spacing w:after="0" w:line="259" w:lineRule="auto"/>
-        <w:ind w:left="0" w:firstLine="0"/>
-        <w:jc w:val="left"/>
-        <w:rPr>
-          <w:b/>
-          <w:sz w:val="32"/>
-        </w:rPr>
-      </w:pPr>
-    </w:p>
-    <w:p>
-      <w:pPr>
-        <w:spacing w:after="0" w:line="259" w:lineRule="auto"/>
-        <w:ind w:left="0" w:firstLine="0"/>
-        <w:jc w:val="left"/>
-        <w:rPr>
-          <w:b/>
-          <w:sz w:val="32"/>
-        </w:rPr>
-      </w:pPr>
-    </w:p>
-    <w:p>
-      <w:pPr>
-        <w:spacing w:after="0" w:line="259" w:lineRule="auto"/>
-        <w:ind w:left="0" w:firstLine="0"/>
-        <w:jc w:val="left"/>
-        <w:rPr>
-          <w:b/>
-          <w:sz w:val="32"/>
-        </w:rPr>
-      </w:pPr>
-      <w:r>
-        <w:rPr>
-          <w:b/>
-          <w:sz w:val="32"/>
-        </w:rPr>
-        <w:t>NAME: MUHAMMAD HAMMAD</w:t>
-      </w:r>
-    </w:p>
-    <w:p>
-      <w:pPr>
-        <w:spacing w:after="0" w:line="259" w:lineRule="auto"/>
-        <w:ind w:left="0" w:firstLine="0"/>
-        <w:jc w:val="left"/>
-        <w:rPr>
-          <w:b/>
-          <w:sz w:val="32"/>
-        </w:rPr>
-      </w:pPr>
-      <w:r>
-        <w:rPr>
-          <w:b/>
-          <w:sz w:val="32"/>
-        </w:rPr>
-        <w:t>INSTRUCTOR: MRS. HIRA</w:t>
-      </w:r>
-    </w:p>
-    <w:p>
-      <w:pPr>
-        <w:spacing w:after="0" w:line="259" w:lineRule="auto"/>
-        <w:ind w:left="0" w:firstLine="0"/>
-        <w:jc w:val="left"/>
-        <w:rPr>
-          <w:b/>
-          <w:sz w:val="32"/>
-        </w:rPr>
-      </w:pPr>
-    </w:p>
-    <w:p>
-      <w:pPr>
-        <w:spacing w:after="0" w:line="259" w:lineRule="auto"/>
-        <w:ind w:left="0" w:firstLine="0"/>
-        <w:jc w:val="left"/>
-      </w:pPr>
-    </w:p>
-    <w:p>
-      <w:pPr>
-        <w:spacing w:after="0" w:line="259" w:lineRule="auto"/>
-        <w:ind w:left="0" w:firstLine="0"/>
-        <w:jc w:val="left"/>
-      </w:pPr>
-      <w:r>
-        <w:rPr>
-          <w:b/>
-          <w:sz w:val="32"/>
-        </w:rPr>
-        <w:t xml:space="preserve"> </w:t>
-      </w:r>
-    </w:p>
-    <w:p>
-      <w:pPr>
-        <w:spacing w:after="21" w:line="259" w:lineRule="auto"/>
-        <w:ind w:left="0" w:firstLine="0"/>
-        <w:jc w:val="left"/>
-      </w:pPr>
-      <w:r>
-        <w:rPr>
-          <w:b/>
-          <w:sz w:val="32"/>
-        </w:rPr>
-        <w:t xml:space="preserve"> </w:t>
-      </w:r>
-    </w:p>
-    <w:p>
-      <w:pPr>
-        <w:spacing w:after="0" w:line="259" w:lineRule="auto"/>
-        <w:ind w:left="0" w:firstLine="0"/>
-        <w:jc w:val="left"/>
-      </w:pPr>
-      <w:r>
-        <w:rPr>
-          <w:b/>
-          <w:sz w:val="32"/>
-        </w:rPr>
-        <w:t xml:space="preserve"> </w:t>
-      </w:r>
-    </w:p>
-    <w:p>
-      <w:pPr>
-        <w:spacing w:after="177" w:line="265" w:lineRule="auto"/>
-        <w:ind w:left="10" w:right="408"/>
-        <w:jc w:val="right"/>
-      </w:pPr>
-      <w:r>
-        <w:rPr>
-          <w:b/>
-          <w:sz w:val="28"/>
-        </w:rPr>
-        <w:t xml:space="preserve">Release: 1.1 </w:t>
-      </w:r>
-    </w:p>
-    <w:p>
-      <w:pPr>
-        <w:spacing w:after="1657" w:line="265" w:lineRule="auto"/>
-        <w:ind w:left="10" w:right="408"/>
-        <w:jc w:val="right"/>
-      </w:pPr>
-      <w:r>
-        <w:rPr>
-          <w:b/>
-          <w:sz w:val="28"/>
-        </w:rPr>
-        <w:t xml:space="preserve">Date: 24-Feb-2025 </w:t>
-      </w:r>
-    </w:p>
-    <w:p>
-      <w:pPr>
-        <w:tabs>
-          <w:tab w:val="center" w:pos="8996"/>
-        </w:tabs>
-        <w:spacing w:after="0" w:line="259" w:lineRule="auto"/>
-        <w:ind w:left="0" w:firstLine="0"/>
-        <w:jc w:val="left"/>
-      </w:pPr>
-      <w:r>
-        <w:rPr>
-          <w:sz w:val="20"/>
-        </w:rPr>
-        <w:t xml:space="preserve"> </w:t>
-      </w:r>
-      <w:r>
-        <w:rPr>
-          <w:sz w:val="20"/>
-        </w:rPr>
-        <w:tab/>
-      </w:r>
-      <w:r>
-        <w:rPr>
-          <w:rFonts w:ascii="Verdana" w:eastAsia="Verdana" w:hAnsi="Verdana" w:cs="Verdana"/>
-        </w:rPr>
-        <w:t xml:space="preserve">1 </w:t>
-      </w:r>
-      <w:r>
-        <w:t xml:space="preserve"> </w:t>
-      </w:r>
-      <w:r>
-        <w:br w:type="page"/>
-      </w:r>
-    </w:p>
-    <w:p>
-      <w:pPr>
         <w:pStyle w:val="Heading1"/>
         <w:spacing w:after="122"/>
         <w:ind w:left="19" w:right="0"/>
       </w:pPr>
       <w:bookmarkStart w:id="0" w:name="_Toc34739"/>
       <w:r>
-        <w:lastRenderedPageBreak/>
         <w:t xml:space="preserve">Task 1 </w:t>
       </w:r>
       <w:bookmarkEnd w:id="0"/>
@@ -697,68 +55,86 @@
         <w:ind w:left="0" w:right="1691" w:firstLine="0"/>
         <w:jc w:val="right"/>
       </w:pPr>
-      <w:proofErr w:type="spellStart"/>
-      <w:r>
-        <w:t>gcc</w:t>
-      </w:r>
-      <w:proofErr w:type="spellEnd"/>
-      <w:r>
-        <w:t xml:space="preserve"> </w:t>
-      </w:r>
-      <w:proofErr w:type="spellStart"/>
-      <w:r>
-        <w:t>pwd_checker.c</w:t>
-      </w:r>
-      <w:proofErr w:type="spellEnd"/>
-      <w:r>
-        <w:t xml:space="preserve"> </w:t>
-      </w:r>
-      <w:proofErr w:type="spellStart"/>
-      <w:r>
-        <w:t>test_pwd_checker.c</w:t>
-      </w:r>
-      <w:proofErr w:type="spellEnd"/>
-      <w:r>
-        <w:t xml:space="preserve"> -o </w:t>
-      </w:r>
-      <w:proofErr w:type="spellStart"/>
-      <w:r>
-        <w:t>pwd_checker</w:t>
-      </w:r>
-      <w:proofErr w:type="spellEnd"/>
-      <w:r>
-        <w:t xml:space="preserve"> </w:t>
-      </w:r>
-      <w:r>
-        <w:tab/>
-      </w:r>
-      <w:r>
-        <w:t xml:space="preserve">                              </w:t>
-      </w:r>
-      <w:r>
-        <w:t xml:space="preserve"> </w:t>
-      </w:r>
-    </w:p>
-    <w:p>
-      <w:pPr>
-        <w:pStyle w:val="Heading1"/>
-        <w:spacing w:after="14" w:line="406" w:lineRule="auto"/>
-        <w:ind w:left="9" w:right="2813" w:firstLine="461"/>
-        <w:jc w:val="center"/>
-      </w:pPr>
-      <w:bookmarkStart w:id="2" w:name="_Toc34741"/>
       <w:r>
         <w:rPr>
           <w:noProof/>
         </w:rPr>
         <w:pict>
-          <v:shape id="_x0000_s1033" type="#_x0000_t75" style="position:absolute;left:0;text-align:left;margin-left:23.7pt;margin-top:1.4pt;width:444pt;height:271.5pt;z-index:-251637760;mso-position-horizontal:absolute;mso-position-horizontal-relative:text;mso-position-vertical:absolute;mso-position-vertical-relative:text;mso-width-relative:page;mso-height-relative:page" wrapcoords="-36 0 -36 21481 109 21958 219 22018 21892 22018 21892 477 21636 0 -36 0">
-            <v:imagedata r:id="rId13" o:title="WhatsApp Image 2026-02-13 at 3.44.58 PM (1)" cropright="21292f"/>
+          <v:shapetype id="_x0000_t75" coordsize="21600,21600" o:spt="75" o:preferrelative="t" path="m@4@5l@4@11@9@11@9@5xe" filled="f" stroked="f">
+            <v:stroke joinstyle="miter"/>
+            <v:formulas>
+              <v:f eqn="if lineDrawn pixelLineWidth 0"/>
+              <v:f eqn="sum @0 1 0"/>
+              <v:f eqn="sum 0 0 @1"/>
+              <v:f eqn="prod @2 1 2"/>
+              <v:f eqn="prod @3 21600 pixelWidth"/>
+              <v:f eqn="prod @3 21600 pixelHeight"/>
+              <v:f eqn="sum @0 0 1"/>
+              <v:f eqn="prod @6 1 2"/>
+              <v:f eqn="prod @7 21600 pixelWidth"/>
+              <v:f eqn="sum @8 21600 0"/>
+              <v:f eqn="prod @7 21600 pixelHeight"/>
+              <v:f eqn="sum @10 21600 0"/>
+            </v:formulas>
+            <v:path o:extrusionok="f" gradientshapeok="t" o:connecttype="rect"/>
+            <o:lock v:ext="edit" aspectratio="t"/>
+          </v:shapetype>
+          <v:shape id="_x0000_s1033" type="#_x0000_t75" style="position:absolute;left:0;text-align:left;margin-left:21.7pt;margin-top:31.45pt;width:444pt;height:271.5pt;z-index:-251637760;mso-position-horizontal-relative:text;mso-position-vertical-relative:text;mso-width-relative:page;mso-height-relative:page" wrapcoords="-36 0 -36 21481 109 21958 219 22018 21892 22018 21892 477 21636 0 -36 0">
+            <v:imagedata r:id="rId8" o:title="WhatsApp Image 2026-02-13 at 3.44" cropright="21292f"/>
             <v:shadow on="t" opacity=".5" offset="6pt,6pt"/>
             <w10:wrap type="through"/>
           </v:shape>
         </w:pict>
       </w:r>
+      <w:proofErr w:type="spellStart"/>
+      <w:r>
+        <w:t>gcc</w:t>
+      </w:r>
+      <w:proofErr w:type="spellEnd"/>
+      <w:r>
+        <w:t xml:space="preserve"> </w:t>
+      </w:r>
+      <w:proofErr w:type="spellStart"/>
+      <w:r>
+        <w:t>pwd_checker.c</w:t>
+      </w:r>
+      <w:proofErr w:type="spellEnd"/>
+      <w:r>
+        <w:t xml:space="preserve"> </w:t>
+      </w:r>
+      <w:proofErr w:type="spellStart"/>
+      <w:r>
+        <w:t>test_pwd_checker.c</w:t>
+      </w:r>
+      <w:proofErr w:type="spellEnd"/>
+      <w:r>
+        <w:t xml:space="preserve"> -o </w:t>
+      </w:r>
+      <w:proofErr w:type="spellStart"/>
+      <w:r>
+        <w:t>pwd_checker</w:t>
+      </w:r>
+      <w:proofErr w:type="spellEnd"/>
+      <w:r>
+        <w:t xml:space="preserve"> </w:t>
+      </w:r>
+      <w:r>
+        <w:tab/>
+      </w:r>
+      <w:r>
+        <w:t xml:space="preserve">                              </w:t>
+      </w:r>
+      <w:r>
+        <w:t xml:space="preserve"> </w:t>
+      </w:r>
+    </w:p>
+    <w:p>
+      <w:pPr>
+        <w:pStyle w:val="Heading1"/>
+        <w:spacing w:after="14" w:line="406" w:lineRule="auto"/>
+        <w:ind w:left="0" w:right="2813" w:firstLine="0"/>
+      </w:pPr>
+      <w:bookmarkStart w:id="2" w:name="_Toc34741"/>
     </w:p>
     <w:p/>
     <w:p>
@@ -775,7 +151,7 @@
         </w:rPr>
         <w:pict>
           <v:shape id="_x0000_s1026" type="#_x0000_t75" style="position:absolute;left:0;text-align:left;margin-left:23.2pt;margin-top:23.35pt;width:449.5pt;height:266.5pt;z-index:-251653120;mso-position-horizontal-relative:text;mso-position-vertical-relative:text;mso-width-relative:page;mso-height-relative:page" wrapcoords="-36 0 -36 21539 180 22026 216 22026 21888 22026 21888 487 21636 0 -36 0">
-            <v:imagedata r:id="rId14" o:title="WhatsApp Image 2026-02-13 at 3.45.00 PM (2)" cropright="19495f"/>
+            <v:imagedata r:id="rId9" o:title="WhatsApp Image 2026-02-13 at 3.45" cropright="19495f"/>
             <v:shadow on="t" opacity=".5" offset="6pt,6pt"/>
             <w10:wrap type="through"/>
           </v:shape>
@@ -795,7 +171,6 @@
         <w:jc w:val="both"/>
       </w:pPr>
       <w:r>
-        <w:lastRenderedPageBreak/>
         <w:t xml:space="preserve">Part 2: Assert Statements </w:t>
       </w:r>
     </w:p>
@@ -843,8 +218,8 @@
           <w:noProof/>
         </w:rPr>
         <w:pict>
-          <v:shape id="_x0000_s1034" type="#_x0000_t75" style="position:absolute;left:0;text-align:left;margin-left:-12.25pt;margin-top:307.95pt;width:474pt;height:267pt;z-index:-251635712;mso-position-horizontal-relative:text;mso-position-vertical-relative:text;mso-width-relative:page;mso-height-relative:page" wrapcoords="-34 0 -34 21539 137 22025 205 22025 21873 22025 21873 485 21634 0 -34 0">
-            <v:imagedata r:id="rId15" o:title="WhatsApp Image 2026-02-13 at 3.45.04 PM (2)"/>
+          <v:shape id="_x0000_s1034" type="#_x0000_t75" style="position:absolute;left:0;text-align:left;margin-left:-5.75pt;margin-top:305.95pt;width:474pt;height:267pt;z-index:-251635712;mso-position-horizontal-relative:text;mso-position-vertical-relative:text;mso-width-relative:page;mso-height-relative:page" wrapcoords="-34 0 -34 21539 137 22025 205 22025 21873 22025 21873 485 21634 0 -34 0">
+            <v:imagedata r:id="rId10" o:title="WhatsApp Image 2026-02-13 at 3.45"/>
             <v:shadow on="t" opacity=".5" offset="6pt,6pt"/>
             <w10:wrap type="through"/>
           </v:shape>
@@ -855,7 +230,7 @@
           <w:noProof/>
         </w:rPr>
         <w:drawing>
-          <wp:anchor distT="0" distB="0" distL="114300" distR="114300" simplePos="0" relativeHeight="251676672" behindDoc="0" locked="0" layoutInCell="1" allowOverlap="1" wp14:anchorId="34C70C35" wp14:editId="532C278B">
+          <wp:anchor distT="0" distB="0" distL="114300" distR="114300" simplePos="0" relativeHeight="251676672" behindDoc="0" locked="0" layoutInCell="1" allowOverlap="1" wp14:anchorId="56E38DBF" wp14:editId="72C1B179">
             <wp:simplePos x="0" y="0"/>
             <wp:positionH relativeFrom="margin">
               <wp:posOffset>-64770</wp:posOffset>
@@ -897,7 +272,7 @@
                     </pic:cNvPicPr>
                   </pic:nvPicPr>
                   <pic:blipFill>
-                    <a:blip r:embed="rId16" cstate="print">
+                    <a:blip r:embed="rId11" cstate="print">
                       <a:extLst>
                         <a:ext uri="{28A0092B-C50C-407E-A947-70E740481C1C}">
                           <a14:useLocalDpi xmlns:a14="http://schemas.microsoft.com/office/drawing/2010/main" val="0"/>
@@ -962,6 +337,9 @@
       <w:pPr>
         <w:spacing w:after="5" w:line="289" w:lineRule="auto"/>
         <w:ind w:right="703"/>
+        <w:rPr>
+          <w:color w:val="171A1B"/>
+        </w:rPr>
       </w:pPr>
       <w:r>
         <w:rPr>
@@ -986,6 +364,21 @@
     </w:p>
     <w:p>
       <w:pPr>
+        <w:spacing w:after="5" w:line="289" w:lineRule="auto"/>
+        <w:ind w:right="703"/>
+        <w:rPr>
+          <w:color w:val="171A1B"/>
+        </w:rPr>
+      </w:pPr>
+    </w:p>
+    <w:p>
+      <w:pPr>
+        <w:spacing w:after="5" w:line="289" w:lineRule="auto"/>
+        <w:ind w:right="703"/>
+      </w:pPr>
+    </w:p>
+    <w:p>
+      <w:pPr>
         <w:pStyle w:val="Heading1"/>
         <w:spacing w:after="62" w:line="364" w:lineRule="auto"/>
         <w:ind w:left="24" w:right="961" w:firstLine="1181"/>
@@ -993,25 +386,12 @@
       </w:pPr>
       <w:bookmarkStart w:id="3" w:name="_Toc34742"/>
       <w:r>
-        <w:lastRenderedPageBreak/>
         <w:t xml:space="preserve">Part 3: Intro to GDB: start, step, next, finish, print, quit </w:t>
       </w:r>
       <w:bookmarkEnd w:id="3"/>
     </w:p>
     <w:p>
       <w:bookmarkStart w:id="4" w:name="_Toc34744"/>
-      <w:r>
-        <w:rPr>
-          <w:noProof/>
-        </w:rPr>
-        <w:pict>
-          <v:shape id="_x0000_s1035" type="#_x0000_t75" style="position:absolute;left:0;text-align:left;margin-left:1.2pt;margin-top:-.3pt;width:473.95pt;height:266.65pt;z-index:-251633664;mso-position-horizontal:absolute;mso-position-horizontal-relative:text;mso-position-vertical:absolute;mso-position-vertical-relative:text;mso-width-relative:page;mso-height-relative:page" wrapcoords="-34 0 -34 21539 137 22025 205 22025 21873 22025 21873 485 21634 0 -34 0">
-            <v:imagedata r:id="rId17" o:title="WhatsApp Image 2026-02-13 at 3.45.01 PM (1)"/>
-            <v:shadow on="t" opacity=".5" offset="6pt,6pt"/>
-            <w10:wrap type="through"/>
-          </v:shape>
-        </w:pict>
-      </w:r>
     </w:p>
     <w:p/>
     <w:p>
@@ -1021,7 +401,7 @@
         </w:rPr>
         <w:pict>
           <v:shape id="_x0000_s1036" type="#_x0000_t75" style="position:absolute;left:0;text-align:left;margin-left:1.2pt;margin-top:0;width:473.95pt;height:266.65pt;z-index:-251631616;mso-position-horizontal:absolute;mso-position-horizontal-relative:text;mso-position-vertical:top;mso-position-vertical-relative:text;mso-width-relative:page;mso-height-relative:page" wrapcoords="-34 0 -34 21539 137 22025 205 22025 21873 22025 21873 485 21634 0 -34 0">
-            <v:imagedata r:id="rId15" o:title="WhatsApp Image 2026-02-13 at 3.45.04 PM (2)"/>
+            <v:imagedata r:id="rId10" o:title="WhatsApp Image 2026-02-13 at 3.45"/>
             <v:shadow on="t" opacity=".5" offset="6pt,6pt"/>
             <w10:wrap type="through"/>
           </v:shape>
@@ -1044,7 +424,7 @@
         </w:rPr>
         <w:pict>
           <v:shape id="_x0000_s1037" type="#_x0000_t75" style="position:absolute;left:0;text-align:left;margin-left:1.2pt;margin-top:-649.2pt;width:474pt;height:267pt;z-index:-251629568;mso-position-horizontal-relative:text;mso-position-vertical-relative:text;mso-width-relative:page;mso-height-relative:page" wrapcoords="-34 0 -34 21539 137 22025 205 22025 21873 22025 21873 485 21634 0 -34 0">
-            <v:imagedata r:id="rId18" o:title="WhatsApp Image 2026-02-13 at 3.45.02 PM (1)"/>
+            <v:imagedata r:id="rId12" o:title="WhatsApp Image 2026-02-13 at 3.45"/>
             <v:shadow on="t" opacity=".5" offset="6pt,6pt"/>
             <w10:wrap type="through"/>
           </v:shape>
@@ -1059,7 +439,7 @@
         </w:rPr>
         <w:lastRenderedPageBreak/>
         <w:drawing>
-          <wp:anchor distT="0" distB="0" distL="114300" distR="114300" simplePos="0" relativeHeight="251664384" behindDoc="0" locked="0" layoutInCell="1" allowOverlap="1" wp14:anchorId="0C7EA2CF" wp14:editId="71388C4E">
+          <wp:anchor distT="0" distB="0" distL="114300" distR="114300" simplePos="0" relativeHeight="251664384" behindDoc="0" locked="0" layoutInCell="1" allowOverlap="1" wp14:anchorId="37C0CB92" wp14:editId="7A4E7621">
             <wp:simplePos x="0" y="0"/>
             <wp:positionH relativeFrom="margin">
               <wp:align>center</wp:align>
@@ -1101,7 +481,7 @@
                     </pic:cNvPicPr>
                   </pic:nvPicPr>
                   <pic:blipFill>
-                    <a:blip r:embed="rId19" cstate="print">
+                    <a:blip r:embed="rId13" cstate="print">
                       <a:extLst>
                         <a:ext uri="{28A0092B-C50C-407E-A947-70E740481C1C}">
                           <a14:useLocalDpi xmlns:a14="http://schemas.microsoft.com/office/drawing/2010/main" val="0"/>
@@ -1163,7 +543,7 @@
           <w:noProof/>
         </w:rPr>
         <w:drawing>
-          <wp:anchor distT="0" distB="0" distL="114300" distR="114300" simplePos="0" relativeHeight="251687936" behindDoc="0" locked="0" layoutInCell="1" allowOverlap="1" wp14:anchorId="216B7384" wp14:editId="323B4713">
+          <wp:anchor distT="0" distB="0" distL="114300" distR="114300" simplePos="0" relativeHeight="251687936" behindDoc="0" locked="0" layoutInCell="1" allowOverlap="1" wp14:anchorId="2F16D058" wp14:editId="1943794B">
             <wp:simplePos x="0" y="0"/>
             <wp:positionH relativeFrom="margin">
               <wp:align>center</wp:align>
@@ -1205,7 +585,7 @@
                     </pic:cNvPicPr>
                   </pic:nvPicPr>
                   <pic:blipFill>
-                    <a:blip r:embed="rId20" cstate="print">
+                    <a:blip r:embed="rId14" cstate="print">
                       <a:extLst>
                         <a:ext uri="{28A0092B-C50C-407E-A947-70E740481C1C}">
                           <a14:useLocalDpi xmlns:a14="http://schemas.microsoft.com/office/drawing/2010/main" val="0"/>
@@ -1257,13 +637,14 @@
         <w:pStyle w:val="Heading1"/>
         <w:spacing w:after="134"/>
         <w:ind w:left="0" w:right="0" w:firstLine="0"/>
+        <w:jc w:val="center"/>
       </w:pPr>
       <w:r>
         <w:rPr>
           <w:noProof/>
         </w:rPr>
         <w:drawing>
-          <wp:anchor distT="0" distB="0" distL="114300" distR="114300" simplePos="0" relativeHeight="251667456" behindDoc="0" locked="0" layoutInCell="1" allowOverlap="1" wp14:anchorId="27227F9E" wp14:editId="71869076">
+          <wp:anchor distT="0" distB="0" distL="114300" distR="114300" simplePos="0" relativeHeight="251667456" behindDoc="0" locked="0" layoutInCell="1" allowOverlap="1" wp14:anchorId="4C90E3FF" wp14:editId="6D879EDA">
             <wp:simplePos x="0" y="0"/>
             <wp:positionH relativeFrom="margin">
               <wp:align>center</wp:align>
@@ -1305,7 +686,7 @@
                     </pic:cNvPicPr>
                   </pic:nvPicPr>
                   <pic:blipFill>
-                    <a:blip r:embed="rId16" cstate="print">
+                    <a:blip r:embed="rId11" cstate="print">
                       <a:extLst>
                         <a:ext uri="{28A0092B-C50C-407E-A947-70E740481C1C}">
                           <a14:useLocalDpi xmlns:a14="http://schemas.microsoft.com/office/drawing/2010/main" val="0"/>
@@ -1343,7 +724,7 @@
         </w:drawing>
       </w:r>
       <w:r>
-        <w:t xml:space="preserve">Part 4: GDB: break, conditional break, run, continue </w:t>
+        <w:t>Part 4: GDB: break, conditional break, run, continue</w:t>
       </w:r>
     </w:p>
     <w:p>
@@ -1383,7 +764,7 @@
           <w:noProof/>
         </w:rPr>
         <w:drawing>
-          <wp:anchor distT="0" distB="0" distL="114300" distR="114300" simplePos="0" relativeHeight="251668480" behindDoc="1" locked="0" layoutInCell="1" allowOverlap="1" wp14:anchorId="5260E452" wp14:editId="6A23F587">
+          <wp:anchor distT="0" distB="0" distL="114300" distR="114300" simplePos="0" relativeHeight="251668480" behindDoc="1" locked="0" layoutInCell="1" allowOverlap="1" wp14:anchorId="06E5FCA5" wp14:editId="401A0BB3">
             <wp:simplePos x="0" y="0"/>
             <wp:positionH relativeFrom="page">
               <wp:align>center</wp:align>
@@ -1425,7 +806,7 @@
                     </pic:cNvPicPr>
                   </pic:nvPicPr>
                   <pic:blipFill>
-                    <a:blip r:embed="rId21" cstate="print">
+                    <a:blip r:embed="rId15" cstate="print">
                       <a:extLst>
                         <a:ext uri="{28A0092B-C50C-407E-A947-70E740481C1C}">
                           <a14:useLocalDpi xmlns:a14="http://schemas.microsoft.com/office/drawing/2010/main" val="0"/>
@@ -1486,7 +867,7 @@
         <w:lastRenderedPageBreak/>
         <w:pict>
           <v:shape id="_x0000_s1038" type="#_x0000_t75" style="position:absolute;margin-left:-.3pt;margin-top:18.35pt;width:474pt;height:267pt;z-index:-251626496;mso-position-horizontal-relative:text;mso-position-vertical-relative:text;mso-width-relative:page;mso-height-relative:page" wrapcoords="-34 0 -34 21539 137 22025 205 22025 21873 22025 21873 485 21634 0 -34 0">
-            <v:imagedata r:id="rId22" o:title="WhatsApp Image 2026-02-13 at 3.45.04 PM (1)"/>
+            <v:imagedata r:id="rId16" o:title="WhatsApp Image 2026-02-13 at 3.45"/>
             <v:shadow on="t" opacity=".5" offset="6pt,6pt"/>
             <w10:wrap type="through"/>
           </v:shape>
@@ -1514,13 +895,7 @@
         <w:rPr>
           <w:b/>
         </w:rPr>
-        <w:t>“</w:t>
-      </w:r>
-      <w:r>
-        <w:rPr>
-          <w:b/>
-        </w:rPr>
-        <w:t xml:space="preserve">Debug </w:t>
+        <w:t xml:space="preserve">“Debug </w:t>
       </w:r>
       <w:proofErr w:type="spellStart"/>
       <w:r>
@@ -1542,13 +917,7 @@
         <w:rPr>
           <w:b/>
         </w:rPr>
-        <w:t>on your own using the commands you just learn.</w:t>
-      </w:r>
-      <w:r>
-        <w:rPr>
-          <w:b/>
-        </w:rPr>
-        <w:t>”</w:t>
+        <w:t>on your own using the commands you just learn.”</w:t>
       </w:r>
       <w:bookmarkEnd w:id="4"/>
     </w:p>
@@ -1570,7 +939,7 @@
         </w:rPr>
         <w:pict>
           <v:shape id="_x0000_s1039" type="#_x0000_t75" style="position:absolute;left:0;text-align:left;margin-left:-.3pt;margin-top:12.4pt;width:474pt;height:267pt;z-index:-251624448;mso-position-horizontal-relative:text;mso-position-vertical-relative:text;mso-width-relative:page;mso-height-relative:page" wrapcoords="-34 0 -34 21539 137 22025 205 22025 21873 22025 21873 485 21634 0 -34 0">
-            <v:imagedata r:id="rId23" o:title="WhatsApp Image 2026-02-13 at 3.45.03 PM (2)"/>
+            <v:imagedata r:id="rId17" o:title="WhatsApp Image 2026-02-13 at 3.45"/>
             <v:shadow on="t" opacity=".5" offset="6pt,6pt"/>
             <w10:wrap type="through"/>
           </v:shape>
@@ -1661,28 +1030,27 @@
     <w:tbl>
       <w:tblPr>
         <w:tblStyle w:val="TableGrid"/>
-        <w:tblW w:w="8670" w:type="dxa"/>
+        <w:tblW w:w="9204" w:type="dxa"/>
         <w:tblInd w:w="34" w:type="dxa"/>
         <w:tblCellMar>
           <w:top w:w="16" w:type="dxa"/>
           <w:left w:w="10" w:type="dxa"/>
-          <w:bottom w:w="0" w:type="dxa"/>
           <w:right w:w="75" w:type="dxa"/>
         </w:tblCellMar>
         <w:tblLook w:val="04A0" w:firstRow="1" w:lastRow="0" w:firstColumn="1" w:lastColumn="0" w:noHBand="0" w:noVBand="1"/>
       </w:tblPr>
       <w:tblGrid>
-        <w:gridCol w:w="1078"/>
-        <w:gridCol w:w="5806"/>
-        <w:gridCol w:w="1786"/>
+        <w:gridCol w:w="1144"/>
+        <w:gridCol w:w="6164"/>
+        <w:gridCol w:w="1896"/>
       </w:tblGrid>
       <w:tr>
         <w:trPr>
-          <w:trHeight w:val="494"/>
+          <w:trHeight w:val="682"/>
         </w:trPr>
         <w:tc>
           <w:tcPr>
-            <w:tcW w:w="1078" w:type="dxa"/>
+            <w:tcW w:w="1144" w:type="dxa"/>
             <w:tcBorders>
               <w:top w:val="single" w:sz="8" w:space="0" w:color="000000"/>
               <w:left w:val="single" w:sz="8" w:space="0" w:color="000000"/>
@@ -1717,7 +1085,7 @@
         </w:tc>
         <w:tc>
           <w:tcPr>
-            <w:tcW w:w="5807" w:type="dxa"/>
+            <w:tcW w:w="6164" w:type="dxa"/>
             <w:tcBorders>
               <w:top w:val="single" w:sz="8" w:space="0" w:color="000000"/>
               <w:left w:val="single" w:sz="8" w:space="0" w:color="000000"/>
@@ -1743,7 +1111,7 @@
         </w:tc>
         <w:tc>
           <w:tcPr>
-            <w:tcW w:w="1786" w:type="dxa"/>
+            <w:tcW w:w="1896" w:type="dxa"/>
             <w:tcBorders>
               <w:top w:val="single" w:sz="8" w:space="0" w:color="000000"/>
               <w:left w:val="single" w:sz="8" w:space="0" w:color="000000"/>
@@ -1770,11 +1138,11 @@
       </w:tr>
       <w:tr>
         <w:trPr>
-          <w:trHeight w:val="754"/>
+          <w:trHeight w:val="1041"/>
         </w:trPr>
         <w:tc>
           <w:tcPr>
-            <w:tcW w:w="1078" w:type="dxa"/>
+            <w:tcW w:w="1144" w:type="dxa"/>
             <w:tcBorders>
               <w:top w:val="single" w:sz="8" w:space="0" w:color="000000"/>
               <w:left w:val="single" w:sz="8" w:space="0" w:color="000000"/>
@@ -1795,7 +1163,7 @@
         </w:tc>
         <w:tc>
           <w:tcPr>
-            <w:tcW w:w="5807" w:type="dxa"/>
+            <w:tcW w:w="6164" w:type="dxa"/>
             <w:tcBorders>
               <w:top w:val="single" w:sz="8" w:space="0" w:color="000000"/>
               <w:left w:val="single" w:sz="8" w:space="0" w:color="000000"/>
@@ -1816,7 +1184,7 @@
         </w:tc>
         <w:tc>
           <w:tcPr>
-            <w:tcW w:w="1786" w:type="dxa"/>
+            <w:tcW w:w="1896" w:type="dxa"/>
             <w:tcBorders>
               <w:top w:val="single" w:sz="8" w:space="0" w:color="000000"/>
               <w:left w:val="single" w:sz="8" w:space="0" w:color="000000"/>
@@ -1844,11 +1212,11 @@
       </w:tr>
       <w:tr>
         <w:trPr>
-          <w:trHeight w:val="754"/>
+          <w:trHeight w:val="1041"/>
         </w:trPr>
         <w:tc>
           <w:tcPr>
-            <w:tcW w:w="1078" w:type="dxa"/>
+            <w:tcW w:w="1144" w:type="dxa"/>
             <w:tcBorders>
               <w:top w:val="single" w:sz="8" w:space="0" w:color="000000"/>
               <w:left w:val="single" w:sz="8" w:space="0" w:color="000000"/>
@@ -1869,7 +1237,7 @@
         </w:tc>
         <w:tc>
           <w:tcPr>
-            <w:tcW w:w="5807" w:type="dxa"/>
+            <w:tcW w:w="6164" w:type="dxa"/>
             <w:tcBorders>
               <w:top w:val="single" w:sz="8" w:space="0" w:color="000000"/>
               <w:left w:val="single" w:sz="8" w:space="0" w:color="000000"/>
@@ -1890,7 +1258,7 @@
         </w:tc>
         <w:tc>
           <w:tcPr>
-            <w:tcW w:w="1786" w:type="dxa"/>
+            <w:tcW w:w="1896" w:type="dxa"/>
             <w:tcBorders>
               <w:top w:val="single" w:sz="8" w:space="0" w:color="000000"/>
               <w:left w:val="single" w:sz="8" w:space="0" w:color="000000"/>
@@ -1918,11 +1286,11 @@
       </w:tr>
       <w:tr>
         <w:trPr>
-          <w:trHeight w:val="751"/>
+          <w:trHeight w:val="1037"/>
         </w:trPr>
         <w:tc>
           <w:tcPr>
-            <w:tcW w:w="1078" w:type="dxa"/>
+            <w:tcW w:w="1144" w:type="dxa"/>
             <w:tcBorders>
               <w:top w:val="single" w:sz="8" w:space="0" w:color="000000"/>
               <w:left w:val="single" w:sz="8" w:space="0" w:color="000000"/>
@@ -1943,7 +1311,7 @@
         </w:tc>
         <w:tc>
           <w:tcPr>
-            <w:tcW w:w="5807" w:type="dxa"/>
+            <w:tcW w:w="6164" w:type="dxa"/>
             <w:tcBorders>
               <w:top w:val="single" w:sz="8" w:space="0" w:color="000000"/>
               <w:left w:val="single" w:sz="8" w:space="0" w:color="000000"/>
@@ -1964,7 +1332,7 @@
         </w:tc>
         <w:tc>
           <w:tcPr>
-            <w:tcW w:w="1786" w:type="dxa"/>
+            <w:tcW w:w="1896" w:type="dxa"/>
             <w:tcBorders>
               <w:top w:val="single" w:sz="8" w:space="0" w:color="000000"/>
               <w:left w:val="single" w:sz="8" w:space="0" w:color="000000"/>
@@ -1992,11 +1360,11 @@
       </w:tr>
       <w:tr>
         <w:trPr>
-          <w:trHeight w:val="754"/>
+          <w:trHeight w:val="1041"/>
         </w:trPr>
         <w:tc>
           <w:tcPr>
-            <w:tcW w:w="1078" w:type="dxa"/>
+            <w:tcW w:w="1144" w:type="dxa"/>
             <w:tcBorders>
               <w:top w:val="single" w:sz="8" w:space="0" w:color="000000"/>
               <w:left w:val="single" w:sz="8" w:space="0" w:color="000000"/>
@@ -2017,7 +1385,7 @@
         </w:tc>
         <w:tc>
           <w:tcPr>
-            <w:tcW w:w="5807" w:type="dxa"/>
+            <w:tcW w:w="6164" w:type="dxa"/>
             <w:tcBorders>
               <w:top w:val="single" w:sz="8" w:space="0" w:color="000000"/>
               <w:left w:val="single" w:sz="8" w:space="0" w:color="000000"/>
@@ -2038,7 +1406,7 @@
         </w:tc>
         <w:tc>
           <w:tcPr>
-            <w:tcW w:w="1786" w:type="dxa"/>
+            <w:tcW w:w="1896" w:type="dxa"/>
             <w:tcBorders>
               <w:top w:val="single" w:sz="8" w:space="0" w:color="000000"/>
               <w:left w:val="single" w:sz="8" w:space="0" w:color="000000"/>
@@ -2066,11 +1434,11 @@
       </w:tr>
       <w:tr>
         <w:trPr>
-          <w:trHeight w:val="754"/>
+          <w:trHeight w:val="1041"/>
         </w:trPr>
         <w:tc>
           <w:tcPr>
-            <w:tcW w:w="1078" w:type="dxa"/>
+            <w:tcW w:w="1144" w:type="dxa"/>
             <w:tcBorders>
               <w:top w:val="single" w:sz="8" w:space="0" w:color="000000"/>
               <w:left w:val="single" w:sz="8" w:space="0" w:color="000000"/>
@@ -2091,7 +1459,7 @@
         </w:tc>
         <w:tc>
           <w:tcPr>
-            <w:tcW w:w="5807" w:type="dxa"/>
+            <w:tcW w:w="6164" w:type="dxa"/>
             <w:tcBorders>
               <w:top w:val="single" w:sz="8" w:space="0" w:color="000000"/>
               <w:left w:val="single" w:sz="8" w:space="0" w:color="000000"/>
@@ -2112,7 +1480,7 @@
         </w:tc>
         <w:tc>
           <w:tcPr>
-            <w:tcW w:w="1786" w:type="dxa"/>
+            <w:tcW w:w="1896" w:type="dxa"/>
             <w:tcBorders>
               <w:top w:val="single" w:sz="8" w:space="0" w:color="000000"/>
               <w:left w:val="single" w:sz="8" w:space="0" w:color="000000"/>
@@ -2140,11 +1508,11 @@
       </w:tr>
       <w:tr>
         <w:trPr>
-          <w:trHeight w:val="751"/>
+          <w:trHeight w:val="1037"/>
         </w:trPr>
         <w:tc>
           <w:tcPr>
-            <w:tcW w:w="1078" w:type="dxa"/>
+            <w:tcW w:w="1144" w:type="dxa"/>
             <w:tcBorders>
               <w:top w:val="single" w:sz="8" w:space="0" w:color="000000"/>
               <w:left w:val="single" w:sz="8" w:space="0" w:color="000000"/>
@@ -2165,7 +1533,7 @@
         </w:tc>
         <w:tc>
           <w:tcPr>
-            <w:tcW w:w="5807" w:type="dxa"/>
+            <w:tcW w:w="6164" w:type="dxa"/>
             <w:tcBorders>
               <w:top w:val="single" w:sz="8" w:space="0" w:color="000000"/>
               <w:left w:val="single" w:sz="8" w:space="0" w:color="000000"/>
@@ -2186,7 +1554,7 @@
         </w:tc>
         <w:tc>
           <w:tcPr>
-            <w:tcW w:w="1786" w:type="dxa"/>
+            <w:tcW w:w="1896" w:type="dxa"/>
             <w:tcBorders>
               <w:top w:val="single" w:sz="8" w:space="0" w:color="000000"/>
               <w:left w:val="single" w:sz="8" w:space="0" w:color="000000"/>
@@ -2214,11 +1582,11 @@
       </w:tr>
       <w:tr>
         <w:trPr>
-          <w:trHeight w:val="751"/>
+          <w:trHeight w:val="1037"/>
         </w:trPr>
         <w:tc>
           <w:tcPr>
-            <w:tcW w:w="1078" w:type="dxa"/>
+            <w:tcW w:w="1144" w:type="dxa"/>
             <w:tcBorders>
               <w:top w:val="single" w:sz="8" w:space="0" w:color="000000"/>
               <w:left w:val="single" w:sz="8" w:space="0" w:color="000000"/>
@@ -2239,7 +1607,7 @@
         </w:tc>
         <w:tc>
           <w:tcPr>
-            <w:tcW w:w="5807" w:type="dxa"/>
+            <w:tcW w:w="6164" w:type="dxa"/>
             <w:tcBorders>
               <w:top w:val="single" w:sz="8" w:space="0" w:color="000000"/>
               <w:left w:val="single" w:sz="8" w:space="0" w:color="000000"/>
@@ -2260,7 +1628,7 @@
         </w:tc>
         <w:tc>
           <w:tcPr>
-            <w:tcW w:w="1786" w:type="dxa"/>
+            <w:tcW w:w="1896" w:type="dxa"/>
             <w:tcBorders>
               <w:top w:val="single" w:sz="8" w:space="0" w:color="000000"/>
               <w:left w:val="single" w:sz="8" w:space="0" w:color="000000"/>
@@ -2300,11 +1668,11 @@
       </w:tr>
       <w:tr>
         <w:trPr>
-          <w:trHeight w:val="756"/>
+          <w:trHeight w:val="1044"/>
         </w:trPr>
         <w:tc>
           <w:tcPr>
-            <w:tcW w:w="1078" w:type="dxa"/>
+            <w:tcW w:w="1144" w:type="dxa"/>
             <w:tcBorders>
               <w:top w:val="single" w:sz="8" w:space="0" w:color="000000"/>
               <w:left w:val="single" w:sz="8" w:space="0" w:color="000000"/>
@@ -2325,7 +1693,7 @@
         </w:tc>
         <w:tc>
           <w:tcPr>
-            <w:tcW w:w="5807" w:type="dxa"/>
+            <w:tcW w:w="6164" w:type="dxa"/>
             <w:tcBorders>
               <w:top w:val="single" w:sz="8" w:space="0" w:color="000000"/>
               <w:left w:val="single" w:sz="8" w:space="0" w:color="000000"/>
@@ -2346,7 +1714,7 @@
         </w:tc>
         <w:tc>
           <w:tcPr>
-            <w:tcW w:w="1786" w:type="dxa"/>
+            <w:tcW w:w="1896" w:type="dxa"/>
             <w:tcBorders>
               <w:top w:val="single" w:sz="8" w:space="0" w:color="000000"/>
               <w:left w:val="single" w:sz="8" w:space="0" w:color="000000"/>
@@ -2382,11 +1750,11 @@
       </w:tr>
       <w:tr>
         <w:trPr>
-          <w:trHeight w:val="752"/>
+          <w:trHeight w:val="1039"/>
         </w:trPr>
         <w:tc>
           <w:tcPr>
-            <w:tcW w:w="1078" w:type="dxa"/>
+            <w:tcW w:w="1144" w:type="dxa"/>
             <w:tcBorders>
               <w:top w:val="single" w:sz="8" w:space="0" w:color="000000"/>
               <w:left w:val="single" w:sz="8" w:space="0" w:color="000000"/>
@@ -2407,7 +1775,7 @@
         </w:tc>
         <w:tc>
           <w:tcPr>
-            <w:tcW w:w="5807" w:type="dxa"/>
+            <w:tcW w:w="6164" w:type="dxa"/>
             <w:tcBorders>
               <w:top w:val="single" w:sz="8" w:space="0" w:color="000000"/>
               <w:left w:val="single" w:sz="8" w:space="0" w:color="000000"/>
@@ -2428,7 +1796,7 @@
         </w:tc>
         <w:tc>
           <w:tcPr>
-            <w:tcW w:w="1786" w:type="dxa"/>
+            <w:tcW w:w="1896" w:type="dxa"/>
             <w:tcBorders>
               <w:top w:val="single" w:sz="8" w:space="0" w:color="000000"/>
               <w:left w:val="single" w:sz="8" w:space="0" w:color="000000"/>
@@ -2456,11 +1824,11 @@
       </w:tr>
       <w:tr>
         <w:trPr>
-          <w:trHeight w:val="754"/>
+          <w:trHeight w:val="1041"/>
         </w:trPr>
         <w:tc>
           <w:tcPr>
-            <w:tcW w:w="1078" w:type="dxa"/>
+            <w:tcW w:w="1144" w:type="dxa"/>
             <w:tcBorders>
               <w:top w:val="single" w:sz="8" w:space="0" w:color="000000"/>
               <w:left w:val="single" w:sz="8" w:space="0" w:color="000000"/>
@@ -2481,7 +1849,7 @@
         </w:tc>
         <w:tc>
           <w:tcPr>
-            <w:tcW w:w="5807" w:type="dxa"/>
+            <w:tcW w:w="6164" w:type="dxa"/>
             <w:tcBorders>
               <w:top w:val="single" w:sz="8" w:space="0" w:color="000000"/>
               <w:left w:val="single" w:sz="8" w:space="0" w:color="000000"/>
@@ -2502,7 +1870,7 @@
         </w:tc>
         <w:tc>
           <w:tcPr>
-            <w:tcW w:w="1786" w:type="dxa"/>
+            <w:tcW w:w="1896" w:type="dxa"/>
             <w:tcBorders>
               <w:top w:val="single" w:sz="8" w:space="0" w:color="000000"/>
               <w:left w:val="single" w:sz="8" w:space="0" w:color="000000"/>
@@ -2530,11 +1898,11 @@
       </w:tr>
       <w:tr>
         <w:trPr>
-          <w:trHeight w:val="754"/>
+          <w:trHeight w:val="1041"/>
         </w:trPr>
         <w:tc>
           <w:tcPr>
-            <w:tcW w:w="1078" w:type="dxa"/>
+            <w:tcW w:w="1144" w:type="dxa"/>
             <w:tcBorders>
               <w:top w:val="single" w:sz="8" w:space="0" w:color="000000"/>
               <w:left w:val="single" w:sz="8" w:space="0" w:color="000000"/>
@@ -2555,7 +1923,7 @@
         </w:tc>
         <w:tc>
           <w:tcPr>
-            <w:tcW w:w="5807" w:type="dxa"/>
+            <w:tcW w:w="6164" w:type="dxa"/>
             <w:tcBorders>
               <w:top w:val="single" w:sz="8" w:space="0" w:color="000000"/>
               <w:left w:val="single" w:sz="8" w:space="0" w:color="000000"/>
@@ -2576,7 +1944,7 @@
         </w:tc>
         <w:tc>
           <w:tcPr>
-            <w:tcW w:w="1786" w:type="dxa"/>
+            <w:tcW w:w="1896" w:type="dxa"/>
             <w:tcBorders>
               <w:top w:val="single" w:sz="8" w:space="0" w:color="000000"/>
               <w:left w:val="single" w:sz="8" w:space="0" w:color="000000"/>
@@ -2639,6 +2007,16 @@
     </w:p>
     <w:p>
       <w:pPr>
+        <w:rPr>
+          <w:b/>
+          <w:sz w:val="28"/>
+        </w:rPr>
+      </w:pPr>
+    </w:p>
+    <w:p/>
+    <w:p/>
+    <w:p>
+      <w:pPr>
         <w:pStyle w:val="Heading2"/>
         <w:spacing w:after="197"/>
         <w:ind w:left="19" w:right="0"/>
@@ -2678,7 +2056,6 @@
         <w:rPr>
           <w:noProof/>
         </w:rPr>
-        <w:lastRenderedPageBreak/>
         <w:drawing>
           <wp:inline distT="0" distB="0" distL="0" distR="0">
             <wp:extent cx="3352292" cy="2812415"/>
@@ -2693,7 +2070,7 @@
                     <pic:cNvPicPr/>
                   </pic:nvPicPr>
                   <pic:blipFill>
-                    <a:blip r:embed="rId24"/>
+                    <a:blip r:embed="rId18"/>
                     <a:stretch>
                       <a:fillRect/>
                     </a:stretch>
@@ -2930,35 +2307,43 @@
       <w:pPr>
         <w:ind w:left="9" w:right="129" w:firstLine="77"/>
       </w:pPr>
+    </w:p>
+    <w:p>
+      <w:pPr>
+        <w:ind w:left="9" w:right="129" w:firstLine="77"/>
+      </w:pPr>
       <w:r>
         <w:rPr>
           <w:noProof/>
         </w:rPr>
         <w:lastRenderedPageBreak/>
         <w:drawing>
-          <wp:anchor distT="0" distB="0" distL="114300" distR="114300" simplePos="0" relativeHeight="251669504" behindDoc="0" locked="0" layoutInCell="1" allowOverlap="1" wp14:anchorId="1D06A225" wp14:editId="22872F79">
+          <wp:anchor distT="0" distB="0" distL="114300" distR="114300" simplePos="0" relativeHeight="251669504" behindDoc="0" locked="0" layoutInCell="1" allowOverlap="1" wp14:anchorId="0894522F" wp14:editId="3D2183AE">
             <wp:simplePos x="0" y="0"/>
             <wp:positionH relativeFrom="margin">
-              <wp:align>center</wp:align>
+              <wp:posOffset>-112395</wp:posOffset>
             </wp:positionH>
             <wp:positionV relativeFrom="paragraph">
-              <wp:posOffset>367665</wp:posOffset>
+              <wp:posOffset>495935</wp:posOffset>
             </wp:positionV>
-            <wp:extent cx="6022340" cy="7769225"/>
-            <wp:effectExtent l="152400" t="152400" r="359410" b="365125"/>
+            <wp:extent cx="6022340" cy="7640955"/>
+            <wp:effectExtent l="152400" t="152400" r="359410" b="360045"/>
             <wp:wrapThrough wrapText="bothSides">
               <wp:wrapPolygon edited="0">
-                <wp:start x="273" y="-424"/>
-                <wp:lineTo x="-547" y="-318"/>
-                <wp:lineTo x="-547" y="21821"/>
-                <wp:lineTo x="478" y="22562"/>
-                <wp:lineTo x="21796" y="22562"/>
+                <wp:start x="273" y="-431"/>
+                <wp:lineTo x="-547" y="-323"/>
+                <wp:lineTo x="-547" y="21810"/>
+                <wp:lineTo x="-342" y="22133"/>
+                <wp:lineTo x="410" y="22456"/>
+                <wp:lineTo x="478" y="22564"/>
+                <wp:lineTo x="21796" y="22564"/>
                 <wp:lineTo x="21864" y="22456"/>
-                <wp:lineTo x="22752" y="21768"/>
-                <wp:lineTo x="22821" y="530"/>
-                <wp:lineTo x="22001" y="-265"/>
-                <wp:lineTo x="21933" y="-424"/>
-                <wp:lineTo x="273" y="-424"/>
+                <wp:lineTo x="22616" y="22079"/>
+                <wp:lineTo x="22821" y="21218"/>
+                <wp:lineTo x="22821" y="539"/>
+                <wp:lineTo x="22001" y="-269"/>
+                <wp:lineTo x="21933" y="-431"/>
+                <wp:lineTo x="273" y="-431"/>
               </wp:wrapPolygon>
             </wp:wrapThrough>
             <wp:docPr id="15" name="Picture 15" descr="C:\Users\Noman Traders\Downloads\FD.drawio.png"/>
@@ -2974,23 +2359,21 @@
                       <a:picLocks noChangeAspect="1" noChangeArrowheads="1"/>
                     </pic:cNvPicPr>
                   </pic:nvPicPr>
-                  <pic:blipFill>
-                    <a:blip r:embed="rId25">
+                  <pic:blipFill rotWithShape="1">
+                    <a:blip r:embed="rId19">
                       <a:extLst>
                         <a:ext uri="{28A0092B-C50C-407E-A947-70E740481C1C}">
                           <a14:useLocalDpi xmlns:a14="http://schemas.microsoft.com/office/drawing/2010/main" val="0"/>
                         </a:ext>
                       </a:extLst>
                     </a:blip>
-                    <a:srcRect/>
-                    <a:stretch>
-                      <a:fillRect/>
-                    </a:stretch>
+                    <a:srcRect t="9033"/>
+                    <a:stretch/>
                   </pic:blipFill>
                   <pic:spPr bwMode="auto">
                     <a:xfrm>
                       <a:off x="0" y="0"/>
-                      <a:ext cx="6022340" cy="7769225"/>
+                      <a:ext cx="6022340" cy="7640955"/>
                     </a:xfrm>
                     <a:prstGeom prst="rect">
                       <a:avLst/>
@@ -3005,18 +2388,24 @@
                         </a:srgbClr>
                       </a:outerShdw>
                     </a:effectLst>
+                    <a:extLst>
+                      <a:ext uri="{53640926-AAD7-44D8-BBD7-CCE9431645EC}">
+                        <a14:shadowObscured xmlns:a14="http://schemas.microsoft.com/office/drawing/2010/main"/>
+                      </a:ext>
+                    </a:extLst>
                   </pic:spPr>
                 </pic:pic>
               </a:graphicData>
             </a:graphic>
+            <wp14:sizeRelH relativeFrom="margin">
+              <wp14:pctWidth>0</wp14:pctWidth>
+            </wp14:sizeRelH>
+            <wp14:sizeRelV relativeFrom="margin">
+              <wp14:pctHeight>0</wp14:pctHeight>
+            </wp14:sizeRelV>
           </wp:anchor>
         </w:drawing>
       </w:r>
-    </w:p>
-    <w:p>
-      <w:pPr>
-        <w:ind w:left="9" w:right="129" w:firstLine="77"/>
-      </w:pPr>
       <w:r>
         <w:br/>
       </w:r>
@@ -3053,7 +2442,7 @@
         </w:rPr>
         <w:lastRenderedPageBreak/>
         <w:drawing>
-          <wp:anchor distT="0" distB="0" distL="114300" distR="114300" simplePos="0" relativeHeight="251671552" behindDoc="0" locked="0" layoutInCell="1" allowOverlap="1" wp14:anchorId="0CA4026B" wp14:editId="0AFD899B">
+          <wp:anchor distT="0" distB="0" distL="114300" distR="114300" simplePos="0" relativeHeight="251671552" behindDoc="0" locked="0" layoutInCell="1" allowOverlap="1" wp14:anchorId="313AC5BE" wp14:editId="36C0D7BA">
             <wp:simplePos x="0" y="0"/>
             <wp:positionH relativeFrom="margin">
               <wp:align>center</wp:align>
@@ -3090,7 +2479,7 @@
                     <pic:cNvPicPr/>
                   </pic:nvPicPr>
                   <pic:blipFill>
-                    <a:blip r:embed="rId26" cstate="print">
+                    <a:blip r:embed="rId20" cstate="print">
                       <a:extLst>
                         <a:ext uri="{28A0092B-C50C-407E-A947-70E740481C1C}">
                           <a14:useLocalDpi xmlns:a14="http://schemas.microsoft.com/office/drawing/2010/main" val="0"/>
@@ -3292,7 +2681,7 @@
                     <pic:cNvPicPr/>
                   </pic:nvPicPr>
                   <pic:blipFill>
-                    <a:blip r:embed="rId27">
+                    <a:blip r:embed="rId21">
                       <a:extLst>
                         <a:ext uri="{28A0092B-C50C-407E-A947-70E740481C1C}">
                           <a14:useLocalDpi xmlns:a14="http://schemas.microsoft.com/office/drawing/2010/main" val="0"/>
@@ -3341,6 +2730,7 @@
         <w:pStyle w:val="Heading2"/>
         <w:ind w:left="19" w:right="0"/>
       </w:pPr>
+      <w:bookmarkStart w:id="8" w:name="_GoBack"/>
       <w:r>
         <w:rPr>
           <w:noProof/>
@@ -3385,7 +2775,7 @@
                     <pic:cNvPicPr/>
                   </pic:nvPicPr>
                   <pic:blipFill>
-                    <a:blip r:embed="rId28" cstate="print">
+                    <a:blip r:embed="rId22" cstate="print">
                       <a:extLst>
                         <a:ext uri="{28A0092B-C50C-407E-A947-70E740481C1C}">
                           <a14:useLocalDpi xmlns:a14="http://schemas.microsoft.com/office/drawing/2010/main" val="0"/>
@@ -3427,6 +2817,7 @@
           </wp:anchor>
         </w:drawing>
       </w:r>
+      <w:bookmarkEnd w:id="8"/>
     </w:p>
     <w:p>
       <w:pPr>
@@ -3474,11 +2865,11 @@
         <w:pStyle w:val="Heading1"/>
         <w:ind w:left="19" w:right="0"/>
       </w:pPr>
-      <w:bookmarkStart w:id="8" w:name="_Toc34748"/>
+      <w:bookmarkStart w:id="9" w:name="_Toc34748"/>
       <w:r>
         <w:t xml:space="preserve">Task 5: </w:t>
       </w:r>
-      <w:bookmarkEnd w:id="8"/>
+      <w:bookmarkEnd w:id="9"/>
     </w:p>
     <w:p>
       <w:pPr>
@@ -3528,7 +2919,7 @@
                     <pic:cNvPicPr/>
                   </pic:nvPicPr>
                   <pic:blipFill>
-                    <a:blip r:embed="rId29"/>
+                    <a:blip r:embed="rId23"/>
                     <a:stretch>
                       <a:fillRect/>
                     </a:stretch>
@@ -3560,12 +2951,6 @@
         <w:tblStyle w:val="TableGrid"/>
         <w:tblW w:w="9063" w:type="dxa"/>
         <w:tblInd w:w="24" w:type="dxa"/>
-        <w:tblCellMar>
-          <w:top w:w="0" w:type="dxa"/>
-          <w:left w:w="0" w:type="dxa"/>
-          <w:bottom w:w="0" w:type="dxa"/>
-          <w:right w:w="0" w:type="dxa"/>
-        </w:tblCellMar>
         <w:tblLook w:val="04A0" w:firstRow="1" w:lastRow="0" w:firstColumn="1" w:lastColumn="0" w:noHBand="0" w:noVBand="1"/>
       </w:tblPr>
       <w:tblGrid>
@@ -3894,7 +3279,7 @@
                     <pic:cNvPicPr/>
                   </pic:nvPicPr>
                   <pic:blipFill>
-                    <a:blip r:embed="rId30">
+                    <a:blip r:embed="rId24">
                       <a:extLst>
                         <a:ext uri="{28A0092B-C50C-407E-A947-70E740481C1C}">
                           <a14:useLocalDpi xmlns:a14="http://schemas.microsoft.com/office/drawing/2010/main" val="0"/>
@@ -3999,7 +3384,7 @@
                     <pic:cNvPicPr/>
                   </pic:nvPicPr>
                   <pic:blipFill>
-                    <a:blip r:embed="rId31" cstate="print">
+                    <a:blip r:embed="rId25" cstate="print">
                       <a:extLst>
                         <a:ext uri="{28A0092B-C50C-407E-A947-70E740481C1C}">
                           <a14:useLocalDpi xmlns:a14="http://schemas.microsoft.com/office/drawing/2010/main" val="0"/>
@@ -4089,11 +3474,11 @@
         <w:pStyle w:val="Heading1"/>
         <w:ind w:left="19" w:right="0"/>
       </w:pPr>
-      <w:bookmarkStart w:id="9" w:name="_Toc34749"/>
+      <w:bookmarkStart w:id="10" w:name="_Toc34749"/>
       <w:r>
         <w:t xml:space="preserve">Task 6: </w:t>
       </w:r>
-      <w:bookmarkEnd w:id="9"/>
+      <w:bookmarkEnd w:id="10"/>
     </w:p>
     <w:p>
       <w:pPr>
@@ -4115,134 +3500,16 @@
       </w:pPr>
       <w:r>
         <w:rPr>
-          <w:sz w:val="28"/>
-        </w:rPr>
-        <w:t xml:space="preserve"> </w:t>
-      </w:r>
-    </w:p>
-    <w:p>
-      <w:pPr>
-        <w:spacing w:after="158" w:line="259" w:lineRule="auto"/>
-        <w:ind w:left="0" w:firstLine="0"/>
-        <w:jc w:val="left"/>
-      </w:pPr>
-      <w:r>
-        <w:rPr>
-          <w:noProof/>
-          <w:sz w:val="28"/>
-        </w:rPr>
-        <w:lastRenderedPageBreak/>
-        <w:drawing>
-          <wp:anchor distT="0" distB="0" distL="114300" distR="114300" simplePos="0" relativeHeight="251674624" behindDoc="1" locked="0" layoutInCell="1" allowOverlap="1" wp14:anchorId="292C5E4D" wp14:editId="262A694B">
-            <wp:simplePos x="0" y="0"/>
-            <wp:positionH relativeFrom="margin">
-              <wp:align>center</wp:align>
-            </wp:positionH>
-            <wp:positionV relativeFrom="paragraph">
-              <wp:posOffset>721360</wp:posOffset>
-            </wp:positionV>
-            <wp:extent cx="6022975" cy="7771765"/>
-            <wp:effectExtent l="171450" t="171450" r="377825" b="381635"/>
-            <wp:wrapThrough wrapText="bothSides">
-              <wp:wrapPolygon edited="0">
-                <wp:start x="273" y="-477"/>
-                <wp:lineTo x="-615" y="-371"/>
-                <wp:lineTo x="-615" y="21814"/>
-                <wp:lineTo x="478" y="22502"/>
-                <wp:lineTo x="478" y="22608"/>
-                <wp:lineTo x="21725" y="22608"/>
-                <wp:lineTo x="21794" y="22502"/>
-                <wp:lineTo x="22818" y="21708"/>
-                <wp:lineTo x="22887" y="477"/>
-                <wp:lineTo x="22067" y="-318"/>
-                <wp:lineTo x="21999" y="-477"/>
-                <wp:lineTo x="273" y="-477"/>
-              </wp:wrapPolygon>
-            </wp:wrapThrough>
-            <wp:docPr id="23" name="Picture 23"/>
-            <wp:cNvGraphicFramePr>
-              <a:graphicFrameLocks xmlns:a="http://schemas.openxmlformats.org/drawingml/2006/main" noChangeAspect="1"/>
-            </wp:cNvGraphicFramePr>
-            <a:graphic xmlns:a="http://schemas.openxmlformats.org/drawingml/2006/main">
-              <a:graphicData uri="http://schemas.openxmlformats.org/drawingml/2006/picture">
-                <pic:pic xmlns:pic="http://schemas.openxmlformats.org/drawingml/2006/picture">
-                  <pic:nvPicPr>
-                    <pic:cNvPr id="23" name="f6.drawio.png"/>
-                    <pic:cNvPicPr/>
-                  </pic:nvPicPr>
-                  <pic:blipFill>
-                    <a:blip r:embed="rId32">
-                      <a:extLst>
-                        <a:ext uri="{28A0092B-C50C-407E-A947-70E740481C1C}">
-                          <a14:useLocalDpi xmlns:a14="http://schemas.microsoft.com/office/drawing/2010/main" val="0"/>
-                        </a:ext>
-                      </a:extLst>
-                    </a:blip>
-                    <a:stretch>
-                      <a:fillRect/>
-                    </a:stretch>
-                  </pic:blipFill>
-                  <pic:spPr>
-                    <a:xfrm>
-                      <a:off x="0" y="0"/>
-                      <a:ext cx="6022975" cy="7771765"/>
-                    </a:xfrm>
-                    <a:prstGeom prst="rect">
-                      <a:avLst/>
-                    </a:prstGeom>
-                    <a:ln>
-                      <a:solidFill>
-                        <a:schemeClr val="tx1"/>
-                      </a:solidFill>
-                    </a:ln>
-                    <a:effectLst>
-                      <a:outerShdw blurRad="292100" dist="139700" dir="2700000" algn="tl" rotWithShape="0">
-                        <a:srgbClr val="333333">
-                          <a:alpha val="65000"/>
-                        </a:srgbClr>
-                      </a:outerShdw>
-                    </a:effectLst>
-                  </pic:spPr>
-                </pic:pic>
-              </a:graphicData>
-            </a:graphic>
-          </wp:anchor>
-        </w:drawing>
-      </w:r>
-    </w:p>
-    <w:p>
-      <w:pPr>
-        <w:spacing w:after="158" w:line="259" w:lineRule="auto"/>
-        <w:ind w:left="0" w:firstLine="0"/>
-        <w:jc w:val="left"/>
-      </w:pPr>
-    </w:p>
-    <w:p>
-      <w:pPr>
-        <w:spacing w:after="158" w:line="259" w:lineRule="auto"/>
-        <w:ind w:left="0" w:firstLine="0"/>
-        <w:jc w:val="left"/>
-      </w:pPr>
-    </w:p>
-    <w:p>
-      <w:pPr>
-        <w:spacing w:after="158" w:line="259" w:lineRule="auto"/>
-        <w:ind w:left="0" w:firstLine="0"/>
-        <w:jc w:val="left"/>
-      </w:pPr>
-      <w:r>
-        <w:rPr>
           <w:noProof/>
         </w:rPr>
-        <w:lastRenderedPageBreak/>
         <w:drawing>
-          <wp:anchor distT="0" distB="0" distL="114300" distR="114300" simplePos="0" relativeHeight="251695104" behindDoc="0" locked="0" layoutInCell="1" allowOverlap="1">
+          <wp:anchor distT="0" distB="0" distL="114300" distR="114300" simplePos="0" relativeHeight="251695104" behindDoc="0" locked="0" layoutInCell="1" allowOverlap="1" wp14:anchorId="4856A8BE" wp14:editId="3F945BB0">
             <wp:simplePos x="0" y="0"/>
             <wp:positionH relativeFrom="page">
               <wp:align>center</wp:align>
             </wp:positionH>
             <wp:positionV relativeFrom="paragraph">
-              <wp:posOffset>476250</wp:posOffset>
+              <wp:posOffset>530003</wp:posOffset>
             </wp:positionV>
             <wp:extent cx="6022975" cy="2390140"/>
             <wp:effectExtent l="152400" t="152400" r="358775" b="353060"/>
@@ -4274,7 +3541,7 @@
                     <pic:cNvPicPr/>
                   </pic:nvPicPr>
                   <pic:blipFill>
-                    <a:blip r:embed="rId33" cstate="print">
+                    <a:blip r:embed="rId26" cstate="print">
                       <a:extLst>
                         <a:ext uri="{28A0092B-C50C-407E-A947-70E740481C1C}">
                           <a14:useLocalDpi xmlns:a14="http://schemas.microsoft.com/office/drawing/2010/main" val="0"/>
@@ -4316,46 +3583,134 @@
           </wp:anchor>
         </w:drawing>
       </w:r>
-    </w:p>
-    <w:p/>
-    <w:p>
-      <w:bookmarkStart w:id="10" w:name="_GoBack"/>
-      <w:bookmarkEnd w:id="10"/>
-    </w:p>
-    <w:p/>
-    <w:p/>
-    <w:p/>
-    <w:p/>
-    <w:p/>
-    <w:p/>
-    <w:p/>
-    <w:p/>
-    <w:p/>
-    <w:p/>
-    <w:p/>
-    <w:p/>
-    <w:p/>
-    <w:p/>
-    <w:p/>
-    <w:p/>
-    <w:p/>
-    <w:p/>
-    <w:p/>
-    <w:p/>
+      <w:r>
+        <w:rPr>
+          <w:sz w:val="28"/>
+        </w:rPr>
+        <w:t xml:space="preserve"> </w:t>
+      </w:r>
+    </w:p>
+    <w:p>
+      <w:pPr>
+        <w:spacing w:after="158" w:line="259" w:lineRule="auto"/>
+        <w:ind w:left="0" w:firstLine="0"/>
+        <w:jc w:val="left"/>
+      </w:pPr>
+      <w:r>
+        <w:rPr>
+          <w:noProof/>
+          <w:sz w:val="28"/>
+        </w:rPr>
+        <w:lastRenderedPageBreak/>
+        <w:drawing>
+          <wp:anchor distT="0" distB="0" distL="114300" distR="114300" simplePos="0" relativeHeight="251674624" behindDoc="1" locked="0" layoutInCell="1" allowOverlap="1" wp14:anchorId="7B1351DA" wp14:editId="2F38006C">
+            <wp:simplePos x="0" y="0"/>
+            <wp:positionH relativeFrom="margin">
+              <wp:align>center</wp:align>
+            </wp:positionH>
+            <wp:positionV relativeFrom="paragraph">
+              <wp:posOffset>721360</wp:posOffset>
+            </wp:positionV>
+            <wp:extent cx="6022975" cy="7771765"/>
+            <wp:effectExtent l="171450" t="171450" r="377825" b="381635"/>
+            <wp:wrapThrough wrapText="bothSides">
+              <wp:wrapPolygon edited="0">
+                <wp:start x="273" y="-477"/>
+                <wp:lineTo x="-615" y="-371"/>
+                <wp:lineTo x="-615" y="21814"/>
+                <wp:lineTo x="478" y="22502"/>
+                <wp:lineTo x="478" y="22608"/>
+                <wp:lineTo x="21725" y="22608"/>
+                <wp:lineTo x="21794" y="22502"/>
+                <wp:lineTo x="22818" y="21708"/>
+                <wp:lineTo x="22887" y="477"/>
+                <wp:lineTo x="22067" y="-318"/>
+                <wp:lineTo x="21999" y="-477"/>
+                <wp:lineTo x="273" y="-477"/>
+              </wp:wrapPolygon>
+            </wp:wrapThrough>
+            <wp:docPr id="23" name="Picture 23"/>
+            <wp:cNvGraphicFramePr>
+              <a:graphicFrameLocks xmlns:a="http://schemas.openxmlformats.org/drawingml/2006/main" noChangeAspect="1"/>
+            </wp:cNvGraphicFramePr>
+            <a:graphic xmlns:a="http://schemas.openxmlformats.org/drawingml/2006/main">
+              <a:graphicData uri="http://schemas.openxmlformats.org/drawingml/2006/picture">
+                <pic:pic xmlns:pic="http://schemas.openxmlformats.org/drawingml/2006/picture">
+                  <pic:nvPicPr>
+                    <pic:cNvPr id="23" name="f6.drawio.png"/>
+                    <pic:cNvPicPr/>
+                  </pic:nvPicPr>
+                  <pic:blipFill>
+                    <a:blip r:embed="rId27">
+                      <a:extLst>
+                        <a:ext uri="{28A0092B-C50C-407E-A947-70E740481C1C}">
+                          <a14:useLocalDpi xmlns:a14="http://schemas.microsoft.com/office/drawing/2010/main" val="0"/>
+                        </a:ext>
+                      </a:extLst>
+                    </a:blip>
+                    <a:stretch>
+                      <a:fillRect/>
+                    </a:stretch>
+                  </pic:blipFill>
+                  <pic:spPr>
+                    <a:xfrm>
+                      <a:off x="0" y="0"/>
+                      <a:ext cx="6022975" cy="7771765"/>
+                    </a:xfrm>
+                    <a:prstGeom prst="rect">
+                      <a:avLst/>
+                    </a:prstGeom>
+                    <a:ln>
+                      <a:solidFill>
+                        <a:schemeClr val="tx1"/>
+                      </a:solidFill>
+                    </a:ln>
+                    <a:effectLst>
+                      <a:outerShdw blurRad="292100" dist="139700" dir="2700000" algn="tl" rotWithShape="0">
+                        <a:srgbClr val="333333">
+                          <a:alpha val="65000"/>
+                        </a:srgbClr>
+                      </a:outerShdw>
+                    </a:effectLst>
+                  </pic:spPr>
+                </pic:pic>
+              </a:graphicData>
+            </a:graphic>
+          </wp:anchor>
+        </w:drawing>
+      </w:r>
+    </w:p>
+    <w:p>
+      <w:pPr>
+        <w:spacing w:after="158" w:line="259" w:lineRule="auto"/>
+        <w:ind w:left="0" w:firstLine="0"/>
+        <w:jc w:val="left"/>
+      </w:pPr>
+    </w:p>
+    <w:p>
+      <w:pPr>
+        <w:ind w:left="0" w:firstLine="0"/>
+      </w:pPr>
+    </w:p>
+    <w:p>
+      <w:pPr>
+        <w:ind w:left="0" w:firstLine="0"/>
+      </w:pPr>
+    </w:p>
     <w:sectPr>
-      <w:headerReference w:type="even" r:id="rId34"/>
-      <w:headerReference w:type="default" r:id="rId35"/>
-      <w:footerReference w:type="even" r:id="rId36"/>
-      <w:footerReference w:type="default" r:id="rId37"/>
-      <w:headerReference w:type="first" r:id="rId38"/>
-      <w:footerReference w:type="first" r:id="rId39"/>
+      <w:headerReference w:type="even" r:id="rId28"/>
+      <w:headerReference w:type="default" r:id="rId29"/>
+      <w:footerReference w:type="even" r:id="rId30"/>
+      <w:footerReference w:type="default" r:id="rId31"/>
+      <w:headerReference w:type="first" r:id="rId32"/>
+      <w:footerReference w:type="first" r:id="rId33"/>
       <w:pgSz w:w="11911" w:h="16841"/>
       <w:pgMar w:top="420" w:right="1010" w:bottom="564" w:left="1416" w:header="720" w:footer="720" w:gutter="0"/>
-      <w:pgBorders w:display="notFirstPage" w:offsetFrom="page">
-        <w:top w:val="single" w:sz="12" w:space="24" w:color="auto"/>
-        <w:left w:val="single" w:sz="12" w:space="24" w:color="auto"/>
-        <w:bottom w:val="single" w:sz="12" w:space="24" w:color="auto"/>
-        <w:right w:val="single" w:sz="12" w:space="24" w:color="auto"/>
+      <w:pgBorders w:zOrder="back" w:offsetFrom="page">
+        <w:top w:val="single" w:sz="18" w:space="24" w:color="auto"/>
+        <w:left w:val="single" w:sz="18" w:space="24" w:color="auto"/>
+        <w:bottom w:val="single" w:sz="18" w:space="24" w:color="auto"/>
+        <w:right w:val="single" w:sz="18" w:space="24" w:color="auto"/>
       </w:pgBorders>
       <w:cols w:space="720"/>
       <w:titlePg/>
@@ -4477,33 +3832,6 @@
     </w:pPr>
     <w:r>
       <w:rPr>
-        <w:sz w:val="20"/>
-      </w:rPr>
-      <w:t xml:space="preserve"> </w:t>
-    </w:r>
-    <w:r>
-      <w:rPr>
-        <w:rFonts w:ascii="Tahoma" w:eastAsia="Tahoma" w:hAnsi="Tahoma" w:cs="Tahoma"/>
-        <w:b/>
-      </w:rPr>
-      <w:t xml:space="preserve">Lab # 01 </w:t>
-    </w:r>
-    <w:r>
-      <w:rPr>
-        <w:rFonts w:ascii="Verdana" w:eastAsia="Verdana" w:hAnsi="Verdana" w:cs="Verdana"/>
-        <w:color w:val="0462C1"/>
-        <w:u w:val="single" w:color="0462C1"/>
-      </w:rPr>
-      <w:t>www.ncdc.pk</w:t>
-    </w:r>
-    <w:r>
-      <w:rPr>
-        <w:rFonts w:ascii="Verdana" w:eastAsia="Verdana" w:hAnsi="Verdana" w:cs="Verdana"/>
-      </w:rPr>
-      <w:t xml:space="preserve"> </w:t>
-    </w:r>
-    <w:r>
-      <w:rPr>
         <w:rFonts w:ascii="Verdana" w:eastAsia="Verdana" w:hAnsi="Verdana" w:cs="Verdana"/>
       </w:rPr>
       <w:tab/>
@@ -4522,7 +3850,7 @@
         <w:rFonts w:ascii="Verdana" w:eastAsia="Verdana" w:hAnsi="Verdana" w:cs="Verdana"/>
         <w:noProof/>
       </w:rPr>
-      <w:t>12</w:t>
+      <w:t>6</w:t>
     </w:r>
     <w:r>
       <w:rPr>
@@ -4747,115 +4075,19 @@
     </w:pPr>
     <w:r>
       <w:rPr>
-        <w:rFonts w:ascii="Calibri" w:eastAsia="Calibri" w:hAnsi="Calibri" w:cs="Calibri"/>
-        <w:noProof/>
-      </w:rPr>
-      <mc:AlternateContent>
-        <mc:Choice Requires="wpg">
-          <w:drawing>
-            <wp:anchor distT="0" distB="0" distL="114300" distR="114300" simplePos="0" relativeHeight="251660288" behindDoc="0" locked="0" layoutInCell="1" allowOverlap="1">
-              <wp:simplePos x="0" y="0"/>
-              <wp:positionH relativeFrom="page">
-                <wp:posOffset>5560695</wp:posOffset>
-              </wp:positionH>
-              <wp:positionV relativeFrom="page">
-                <wp:posOffset>180987</wp:posOffset>
-              </wp:positionV>
-              <wp:extent cx="1663065" cy="545452"/>
-              <wp:effectExtent l="0" t="0" r="0" b="0"/>
-              <wp:wrapSquare wrapText="bothSides"/>
-              <wp:docPr id="34061" name="Group 34061"/>
-              <wp:cNvGraphicFramePr/>
-              <a:graphic xmlns:a="http://schemas.openxmlformats.org/drawingml/2006/main">
-                <a:graphicData uri="http://schemas.microsoft.com/office/word/2010/wordprocessingGroup">
-                  <wpg:wgp>
-                    <wpg:cNvGrpSpPr/>
-                    <wpg:grpSpPr>
-                      <a:xfrm>
-                        <a:off x="0" y="0"/>
-                        <a:ext cx="1663065" cy="545452"/>
-                        <a:chOff x="0" y="0"/>
-                        <a:chExt cx="1663065" cy="545452"/>
-                      </a:xfrm>
-                    </wpg:grpSpPr>
-                    <pic:pic xmlns:pic="http://schemas.openxmlformats.org/drawingml/2006/picture">
-                      <pic:nvPicPr>
-                        <pic:cNvPr id="34062" name="Picture 34062"/>
-                        <pic:cNvPicPr/>
-                      </pic:nvPicPr>
-                      <pic:blipFill>
-                        <a:blip r:embed="rId1"/>
-                        <a:stretch>
-                          <a:fillRect/>
-                        </a:stretch>
-                      </pic:blipFill>
-                      <pic:spPr>
-                        <a:xfrm>
-                          <a:off x="0" y="0"/>
-                          <a:ext cx="568960" cy="545452"/>
-                        </a:xfrm>
-                        <a:prstGeom prst="rect">
-                          <a:avLst/>
-                        </a:prstGeom>
-                      </pic:spPr>
-                    </pic:pic>
-                    <pic:pic xmlns:pic="http://schemas.openxmlformats.org/drawingml/2006/picture">
-                      <pic:nvPicPr>
-                        <pic:cNvPr id="34063" name="Picture 34063"/>
-                        <pic:cNvPicPr/>
-                      </pic:nvPicPr>
-                      <pic:blipFill>
-                        <a:blip r:embed="rId2"/>
-                        <a:stretch>
-                          <a:fillRect/>
-                        </a:stretch>
-                      </pic:blipFill>
-                      <pic:spPr>
-                        <a:xfrm>
-                          <a:off x="666750" y="174575"/>
-                          <a:ext cx="996315" cy="356146"/>
-                        </a:xfrm>
-                        <a:prstGeom prst="rect">
-                          <a:avLst/>
-                        </a:prstGeom>
-                      </pic:spPr>
-                    </pic:pic>
-                  </wpg:wgp>
-                </a:graphicData>
-              </a:graphic>
-            </wp:anchor>
-          </w:drawing>
-        </mc:Choice>
-        <mc:Fallback xmlns:a="http://schemas.openxmlformats.org/drawingml/2006/main">
-          <w:pict>
-            <v:group id="Group 34061" style="width:130.95pt;height:42.949pt;position:absolute;mso-position-horizontal-relative:page;mso-position-horizontal:absolute;margin-left:437.85pt;mso-position-vertical-relative:page;margin-top:14.2509pt;" coordsize="16630,5454">
-              <v:shape id="Picture 34062" style="position:absolute;width:5689;height:5454;left:0;top:0;" filled="f">
-                <v:imagedata r:id="rId19"/>
-              </v:shape>
-              <v:shape id="Picture 34063" style="position:absolute;width:9963;height:3561;left:6667;top:1745;" filled="f">
-                <v:imagedata r:id="rId20"/>
-              </v:shape>
-              <w10:wrap type="square"/>
-            </v:group>
-          </w:pict>
-        </mc:Fallback>
-      </mc:AlternateContent>
-    </w:r>
-    <w:r>
-      <w:rPr>
         <w:noProof/>
       </w:rPr>
       <w:drawing>
         <wp:anchor distT="0" distB="0" distL="114300" distR="114300" simplePos="0" relativeHeight="251661312" behindDoc="0" locked="0" layoutInCell="1" allowOverlap="0">
           <wp:simplePos x="0" y="0"/>
           <wp:positionH relativeFrom="page">
-            <wp:posOffset>228600</wp:posOffset>
+            <wp:posOffset>254000</wp:posOffset>
           </wp:positionH>
           <wp:positionV relativeFrom="page">
             <wp:posOffset>246380</wp:posOffset>
           </wp:positionV>
           <wp:extent cx="487045" cy="473075"/>
-          <wp:effectExtent l="0" t="0" r="0" b="0"/>
+          <wp:effectExtent l="0" t="0" r="8255" b="3175"/>
           <wp:wrapSquare wrapText="bothSides"/>
           <wp:docPr id="1" name="Picture 1"/>
           <wp:cNvGraphicFramePr/>
@@ -4867,7 +4099,7 @@
                   <pic:cNvPicPr/>
                 </pic:nvPicPr>
                 <pic:blipFill>
-                  <a:blip r:embed="rId21"/>
+                  <a:blip r:embed="rId1"/>
                   <a:stretch>
                     <a:fillRect/>
                   </a:stretch>
@@ -8769,7 +8001,7 @@
 </file>
 
 <file path=customXml/itemProps1.xml><?xml version="1.0" encoding="utf-8"?>
-<ds:datastoreItem xmlns:ds="http://schemas.openxmlformats.org/officeDocument/2006/customXml" ds:itemID="{05EA9A96-51DD-4F5D-8FD2-F8B56405CD1D}">
+<ds:datastoreItem xmlns:ds="http://schemas.openxmlformats.org/officeDocument/2006/customXml" ds:itemID="{D287FF66-C1A0-4FF2-826D-0BD73E549B9A}">
   <ds:schemaRefs>
     <ds:schemaRef ds:uri="http://schemas.openxmlformats.org/officeDocument/2006/bibliography"/>
   </ds:schemaRefs>

</xml_diff>